<commit_message>
He modificado el apartado usuarios en empleado para que se vea los toles y su tipo y que se vea todo perfectamente
</commit_message>
<xml_diff>
--- a/documentacion/documentacion.docx
+++ b/documentacion/documentacion.docx
@@ -1,18 +1,1045 @@
 
 <file path=word/document.xml><?xml version="1.0" encoding="utf-8"?>
-<w:document xmlns:wpc="http://schemas.microsoft.com/office/word/2010/wordprocessingCanvas" xmlns:cx="http://schemas.microsoft.com/office/drawing/2014/chartex" xmlns:cx1="http://schemas.microsoft.com/office/drawing/2015/9/8/chartex" xmlns:cx2="http://schemas.microsoft.com/office/drawing/2015/10/21/chartex" xmlns:cx3="http://schemas.microsoft.com/office/drawing/2016/5/9/chartex" xmlns:cx4="http://schemas.microsoft.com/office/drawing/2016/5/10/chartex" xmlns:cx5="http://schemas.microsoft.com/office/drawing/2016/5/11/chartex" xmlns:cx6="http://schemas.microsoft.com/office/drawing/2016/5/12/chartex" xmlns:cx7="http://schemas.microsoft.com/office/drawing/2016/5/13/chartex" xmlns:cx8="http://schemas.microsoft.com/office/drawing/2016/5/14/chartex" xmlns:mc="http://schemas.openxmlformats.org/markup-compatibility/2006" xmlns:aink="http://schemas.microsoft.com/office/drawing/2016/ink" xmlns:am3d="http://schemas.microsoft.com/office/drawing/2017/model3d" xmlns:o="urn:schemas-microsoft-com:office:office" xmlns:oel="http://schemas.microsoft.com/office/2019/extlst" xmlns:r="http://schemas.openxmlformats.org/officeDocument/2006/relationships" xmlns:m="http://schemas.openxmlformats.org/officeDocument/2006/math" xmlns:v="urn:schemas-microsoft-com:vml" xmlns:wp14="http://schemas.microsoft.com/office/word/2010/wordprocessingDrawing" xmlns:wp="http://schemas.openxmlformats.org/drawingml/2006/wordprocessingDrawing" xmlns:w10="urn:schemas-microsoft-com:office:word" xmlns:w="http://schemas.openxmlformats.org/wordprocessingml/2006/main" xmlns:w14="http://schemas.microsoft.com/office/word/2010/wordml" xmlns:w15="http://schemas.microsoft.com/office/word/2012/wordml" xmlns:w16cex="http://schemas.microsoft.com/office/word/2018/wordml/cex" xmlns:w16cid="http://schemas.microsoft.com/office/word/2016/wordml/cid" xmlns:w16="http://schemas.microsoft.com/office/word/2018/wordml" xmlns:w16sdtdh="http://schemas.microsoft.com/office/word/2020/wordml/sdtdatahash" xmlns:w16se="http://schemas.microsoft.com/office/word/2015/wordml/symex" xmlns:wpg="http://schemas.microsoft.com/office/word/2010/wordprocessingGroup" xmlns:wpi="http://schemas.microsoft.com/office/word/2010/wordprocessingInk" xmlns:wne="http://schemas.microsoft.com/office/word/2006/wordml" xmlns:wps="http://schemas.microsoft.com/office/word/2010/wordprocessingShape" mc:Ignorable="w14 w15 w16se w16cid w16 w16cex w16sdtdh wp14">
+<w:document xmlns:wpc="http://schemas.microsoft.com/office/word/2010/wordprocessingCanvas" xmlns:cx="http://schemas.microsoft.com/office/drawing/2014/chartex" xmlns:cx1="http://schemas.microsoft.com/office/drawing/2015/9/8/chartex" xmlns:cx2="http://schemas.microsoft.com/office/drawing/2015/10/21/chartex" xmlns:cx3="http://schemas.microsoft.com/office/drawing/2016/5/9/chartex" xmlns:cx4="http://schemas.microsoft.com/office/drawing/2016/5/10/chartex" xmlns:cx5="http://schemas.microsoft.com/office/drawing/2016/5/11/chartex" xmlns:cx6="http://schemas.microsoft.com/office/drawing/2016/5/12/chartex" xmlns:cx7="http://schemas.microsoft.com/office/drawing/2016/5/13/chartex" xmlns:cx8="http://schemas.microsoft.com/office/drawing/2016/5/14/chartex" xmlns:mc="http://schemas.openxmlformats.org/markup-compatibility/2006" xmlns:aink="http://schemas.microsoft.com/office/drawing/2016/ink" xmlns:am3d="http://schemas.microsoft.com/office/drawing/2017/model3d" xmlns:o="urn:schemas-microsoft-com:office:office" xmlns:oel="http://schemas.microsoft.com/office/2019/extlst" xmlns:r="http://schemas.openxmlformats.org/officeDocument/2006/relationships" xmlns:m="http://schemas.openxmlformats.org/officeDocument/2006/math" xmlns:v="urn:schemas-microsoft-com:vml" xmlns:wp14="http://schemas.microsoft.com/office/word/2010/wordprocessingDrawing" xmlns:wp="http://schemas.openxmlformats.org/drawingml/2006/wordprocessingDrawing" xmlns:w10="urn:schemas-microsoft-com:office:word" xmlns:w="http://schemas.openxmlformats.org/wordprocessingml/2006/main" xmlns:w14="http://schemas.microsoft.com/office/word/2010/wordml" xmlns:w15="http://schemas.microsoft.com/office/word/2012/wordml" xmlns:w16cex="http://schemas.microsoft.com/office/word/2018/wordml/cex" xmlns:w16cid="http://schemas.microsoft.com/office/word/2016/wordml/cid" xmlns:w16="http://schemas.microsoft.com/office/word/2018/wordml" xmlns:w16du="http://schemas.microsoft.com/office/word/2023/wordml/word16du" xmlns:w16sdtdh="http://schemas.microsoft.com/office/word/2020/wordml/sdtdatahash" xmlns:w16sdtfl="http://schemas.microsoft.com/office/word/2024/wordml/sdtformatlock" xmlns:w16se="http://schemas.microsoft.com/office/word/2015/wordml/symex" xmlns:wpg="http://schemas.microsoft.com/office/word/2010/wordprocessingGroup" xmlns:wpi="http://schemas.microsoft.com/office/word/2010/wordprocessingInk" xmlns:wne="http://schemas.microsoft.com/office/word/2006/wordml" xmlns:wps="http://schemas.microsoft.com/office/word/2010/wordprocessingShape" mc:Ignorable="w14 w15 w16se w16cid w16 w16cex w16sdtdh w16sdtfl w16du wp14">
   <w:body>
     <w:p>
-      <w:r>
-        <w:t>Documentación del Sistema de Gestión para Tienda de Pinturas.</w:t>
+      <w:pPr>
+        <w:spacing w:line="278" w:lineRule="auto"/>
+        <w:rPr>
+          <w:b/>
+          <w:bCs/>
+        </w:rPr>
+      </w:pPr>
+      <w:r>
+        <w:rPr>
+          <w:b/>
+          <w:bCs/>
+        </w:rPr>
+        <w:t>Sistema de Gestión para Tienda de Pinturas</w:t>
+      </w:r>
+    </w:p>
+    <w:p>
+      <w:pPr>
+        <w:spacing w:line="278" w:lineRule="auto"/>
+        <w:rPr>
+          <w:b/>
+          <w:bCs/>
+        </w:rPr>
+      </w:pPr>
+      <w:r>
+        <w:rPr>
+          <w:b/>
+          <w:bCs/>
+        </w:rPr>
+        <w:t>1. Introducción</w:t>
+      </w:r>
+    </w:p>
+    <w:p>
+      <w:pPr>
+        <w:spacing w:line="278" w:lineRule="auto"/>
+      </w:pPr>
+      <w:r>
+        <w:t>Para mi proyecto final he desarrollado una solución integral de escritorio orientada a la gestión de una </w:t>
+      </w:r>
+      <w:r>
+        <w:rPr>
+          <w:b/>
+          <w:bCs/>
+        </w:rPr>
+        <w:t>Tienda de Pinturas</w:t>
+      </w:r>
+      <w:r>
+        <w:t>. Mi objetivo principal con este proyecto ha sido crear una aplicación robusta, segura y con una interfaz (</w:t>
+      </w:r>
+      <w:proofErr w:type="spellStart"/>
+      <w:r>
+        <w:t>Dashboard</w:t>
+      </w:r>
+      <w:proofErr w:type="spellEnd"/>
+      <w:r>
+        <w:t>) que permita a distintos tipos de usuarios interactuar con el sistema según su rol (empleados y clientes). El sistema permite el registro de nuevos usuarios, el control exhaustivo del inventario de pinturas y la gestión automatizada de las transacciones de compra.</w:t>
+      </w:r>
+    </w:p>
+    <w:p>
+      <w:pPr>
+        <w:spacing w:line="278" w:lineRule="auto"/>
+        <w:rPr>
+          <w:b/>
+          <w:bCs/>
+        </w:rPr>
+      </w:pPr>
+      <w:r>
+        <w:rPr>
+          <w:b/>
+          <w:bCs/>
+        </w:rPr>
+        <w:t>2. Objetivos del Proyecto</w:t>
+      </w:r>
+    </w:p>
+    <w:p>
+      <w:pPr>
+        <w:spacing w:line="278" w:lineRule="auto"/>
+      </w:pPr>
+      <w:r>
+        <w:t>Durante el desarrollo del sistema, me propuse alcanzar los siguientes objetivos:</w:t>
+      </w:r>
+    </w:p>
+    <w:p>
+      <w:pPr>
+        <w:numPr>
+          <w:ilvl w:val="0"/>
+          <w:numId w:val="1"/>
+        </w:numPr>
+        <w:spacing w:line="278" w:lineRule="auto"/>
+      </w:pPr>
+      <w:r>
+        <w:rPr>
+          <w:b/>
+          <w:bCs/>
+        </w:rPr>
+        <w:t>Gestión Segura de Usuarios:</w:t>
+      </w:r>
+      <w:r>
+        <w:t> Implementar un sistema de autenticación y registro (Login/Registro) que diferencie de manera clara entre clientes y empleados, asignando permisos específicos según el rol.</w:t>
+      </w:r>
+    </w:p>
+    <w:p>
+      <w:pPr>
+        <w:numPr>
+          <w:ilvl w:val="0"/>
+          <w:numId w:val="1"/>
+        </w:numPr>
+        <w:spacing w:line="278" w:lineRule="auto"/>
+      </w:pPr>
+      <w:r>
+        <w:rPr>
+          <w:b/>
+          <w:bCs/>
+        </w:rPr>
+        <w:t>Gestión de Inventario:</w:t>
+      </w:r>
+      <w:r>
+        <w:t> Desarrollar un módulo CRUD (Crear, Leer, Actualizar, Borrar) para el control total de los productos de pintura.</w:t>
+      </w:r>
+    </w:p>
+    <w:p>
+      <w:pPr>
+        <w:numPr>
+          <w:ilvl w:val="0"/>
+          <w:numId w:val="1"/>
+        </w:numPr>
+        <w:spacing w:line="278" w:lineRule="auto"/>
+      </w:pPr>
+      <w:r>
+        <w:rPr>
+          <w:b/>
+          <w:bCs/>
+        </w:rPr>
+        <w:t>Control de Accesos:</w:t>
+      </w:r>
+      <w:r>
+        <w:t> Restringir las funcionalidades operativas: asegurar que los clientes solo puedan consultar el catálogo y realizar compras, bloqueando su capacidad de crear o eliminar productos.</w:t>
+      </w:r>
+    </w:p>
+    <w:p>
+      <w:pPr>
+        <w:numPr>
+          <w:ilvl w:val="0"/>
+          <w:numId w:val="1"/>
+        </w:numPr>
+        <w:spacing w:line="278" w:lineRule="auto"/>
+      </w:pPr>
+      <w:r>
+        <w:rPr>
+          <w:b/>
+          <w:bCs/>
+        </w:rPr>
+        <w:t>Automatización de Compras:</w:t>
+      </w:r>
+      <w:r>
+        <w:t> Crear un flujo de compras inteligente que calcule de manera automática el precio total basado en la cantidad solicitada.</w:t>
+      </w:r>
+    </w:p>
+    <w:p>
+      <w:pPr>
+        <w:numPr>
+          <w:ilvl w:val="0"/>
+          <w:numId w:val="1"/>
+        </w:numPr>
+        <w:spacing w:line="278" w:lineRule="auto"/>
+      </w:pPr>
+      <w:r>
+        <w:rPr>
+          <w:b/>
+          <w:bCs/>
+        </w:rPr>
+        <w:t>Actualización de Stock en Tiempo Real:</w:t>
+      </w:r>
+      <w:r>
+        <w:t> Integrar disparadores a nivel de código para que el stock de una pintura se descuente automáticamente de la base de datos cada vez que un cliente confirma una compra.</w:t>
+      </w:r>
+    </w:p>
+    <w:p>
+      <w:pPr>
+        <w:spacing w:line="278" w:lineRule="auto"/>
+        <w:rPr>
+          <w:b/>
+          <w:bCs/>
+        </w:rPr>
+      </w:pPr>
+      <w:r>
+        <w:rPr>
+          <w:b/>
+          <w:bCs/>
+        </w:rPr>
+        <w:t>3. Tecnologías y Entorno de Desarrollo</w:t>
+      </w:r>
+    </w:p>
+    <w:p>
+      <w:pPr>
+        <w:spacing w:line="278" w:lineRule="auto"/>
+      </w:pPr>
+      <w:r>
+        <w:t xml:space="preserve">Para la construcción del sistema, he elegido el siguiente </w:t>
+      </w:r>
+      <w:proofErr w:type="spellStart"/>
+      <w:r>
+        <w:t>stack</w:t>
+      </w:r>
+      <w:proofErr w:type="spellEnd"/>
+      <w:r>
+        <w:t xml:space="preserve"> tecnológico:</w:t>
+      </w:r>
+    </w:p>
+    <w:p>
+      <w:pPr>
+        <w:numPr>
+          <w:ilvl w:val="0"/>
+          <w:numId w:val="2"/>
+        </w:numPr>
+        <w:spacing w:line="278" w:lineRule="auto"/>
+      </w:pPr>
+      <w:r>
+        <w:rPr>
+          <w:b/>
+          <w:bCs/>
+        </w:rPr>
+        <w:t>Lenguaje de Programación:</w:t>
+      </w:r>
+      <w:r>
+        <w:t> Java (JDK 8 o superior).</w:t>
+      </w:r>
+    </w:p>
+    <w:p>
+      <w:pPr>
+        <w:numPr>
+          <w:ilvl w:val="0"/>
+          <w:numId w:val="2"/>
+        </w:numPr>
+        <w:spacing w:line="278" w:lineRule="auto"/>
+      </w:pPr>
+      <w:r>
+        <w:rPr>
+          <w:b/>
+          <w:bCs/>
+        </w:rPr>
+        <w:t>Interfaz Gráfica:</w:t>
+      </w:r>
+      <w:r>
+        <w:t> Java Swing, personalizando el aspecto visual mediante el uso del tema </w:t>
+      </w:r>
+      <w:proofErr w:type="spellStart"/>
+      <w:r>
+        <w:rPr>
+          <w:i/>
+          <w:iCs/>
+        </w:rPr>
+        <w:t>Nimbus</w:t>
+      </w:r>
+      <w:proofErr w:type="spellEnd"/>
+      <w:r>
+        <w:t> para una interfaz más moderna.</w:t>
+      </w:r>
+    </w:p>
+    <w:p>
+      <w:pPr>
+        <w:numPr>
+          <w:ilvl w:val="0"/>
+          <w:numId w:val="2"/>
+        </w:numPr>
+        <w:spacing w:line="278" w:lineRule="auto"/>
+      </w:pPr>
+      <w:r>
+        <w:rPr>
+          <w:b/>
+          <w:bCs/>
+        </w:rPr>
+        <w:t>Base de Datos:</w:t>
+      </w:r>
+      <w:r>
+        <w:t xml:space="preserve"> MySQL. El servidor de base de datos se ejecuta mediante un entorno </w:t>
+      </w:r>
+      <w:proofErr w:type="spellStart"/>
+      <w:r>
+        <w:t>contenedorizado</w:t>
+      </w:r>
+      <w:proofErr w:type="spellEnd"/>
+      <w:r>
+        <w:t xml:space="preserve"> en </w:t>
+      </w:r>
+      <w:r>
+        <w:rPr>
+          <w:b/>
+          <w:bCs/>
+        </w:rPr>
+        <w:t>Docker</w:t>
+      </w:r>
+      <w:r>
+        <w:t>, mapeado al puerto 3307 para evitar conflictos con instalaciones locales.</w:t>
+      </w:r>
+    </w:p>
+    <w:p>
+      <w:pPr>
+        <w:numPr>
+          <w:ilvl w:val="0"/>
+          <w:numId w:val="2"/>
+        </w:numPr>
+        <w:spacing w:line="278" w:lineRule="auto"/>
+      </w:pPr>
+      <w:r>
+        <w:rPr>
+          <w:b/>
+          <w:bCs/>
+        </w:rPr>
+        <w:t>Conexión a Datos:</w:t>
+      </w:r>
+      <w:r>
+        <w:t> Controlador JDBC de MySQL (mysql-connector-java-8.0.30.jar).</w:t>
+      </w:r>
+    </w:p>
+    <w:p>
+      <w:pPr>
+        <w:numPr>
+          <w:ilvl w:val="0"/>
+          <w:numId w:val="2"/>
+        </w:numPr>
+        <w:spacing w:line="278" w:lineRule="auto"/>
+      </w:pPr>
+      <w:r>
+        <w:rPr>
+          <w:b/>
+          <w:bCs/>
+        </w:rPr>
+        <w:t>Control de Versiones:</w:t>
+      </w:r>
+      <w:r>
+        <w:t> Git, con un repositorio remoto alojado en GitHub.</w:t>
+      </w:r>
+    </w:p>
+    <w:p>
+      <w:pPr>
+        <w:spacing w:line="278" w:lineRule="auto"/>
+        <w:rPr>
+          <w:b/>
+          <w:bCs/>
+        </w:rPr>
+      </w:pPr>
+      <w:r>
+        <w:rPr>
+          <w:b/>
+          <w:bCs/>
+        </w:rPr>
+        <w:t>4. Arquitectura del Sistema y Patrones de Diseño</w:t>
+      </w:r>
+    </w:p>
+    <w:p>
+      <w:pPr>
+        <w:spacing w:line="278" w:lineRule="auto"/>
+      </w:pPr>
+      <w:r>
+        <w:t>He desarrollado el sistema aplicando una arquitectura </w:t>
+      </w:r>
+      <w:r>
+        <w:rPr>
+          <w:b/>
+          <w:bCs/>
+        </w:rPr>
+        <w:t>MVC (Model-View-</w:t>
+      </w:r>
+      <w:proofErr w:type="spellStart"/>
+      <w:r>
+        <w:rPr>
+          <w:b/>
+          <w:bCs/>
+        </w:rPr>
+        <w:t>Controller</w:t>
+      </w:r>
+      <w:proofErr w:type="spellEnd"/>
+      <w:r>
+        <w:rPr>
+          <w:b/>
+          <w:bCs/>
+        </w:rPr>
+        <w:t>)</w:t>
+      </w:r>
+      <w:r>
+        <w:t> en conjunto con los patrones </w:t>
+      </w:r>
+      <w:r>
+        <w:rPr>
+          <w:b/>
+          <w:bCs/>
+        </w:rPr>
+        <w:t xml:space="preserve">DAO (Data Access </w:t>
+      </w:r>
+      <w:proofErr w:type="spellStart"/>
+      <w:r>
+        <w:rPr>
+          <w:b/>
+          <w:bCs/>
+        </w:rPr>
+        <w:t>Object</w:t>
+      </w:r>
+      <w:proofErr w:type="spellEnd"/>
+      <w:r>
+        <w:rPr>
+          <w:b/>
+          <w:bCs/>
+        </w:rPr>
+        <w:t>)</w:t>
+      </w:r>
+      <w:r>
+        <w:t> y </w:t>
+      </w:r>
+      <w:r>
+        <w:rPr>
+          <w:b/>
+          <w:bCs/>
+        </w:rPr>
+        <w:t xml:space="preserve">DTO (Data Transfer </w:t>
+      </w:r>
+      <w:proofErr w:type="spellStart"/>
+      <w:r>
+        <w:rPr>
+          <w:b/>
+          <w:bCs/>
+        </w:rPr>
+        <w:t>Object</w:t>
+      </w:r>
+      <w:proofErr w:type="spellEnd"/>
+      <w:r>
+        <w:rPr>
+          <w:b/>
+          <w:bCs/>
+        </w:rPr>
+        <w:t>)</w:t>
+      </w:r>
+      <w:r>
+        <w:t>. Esto me ha permitido asegurar que la interfaz gráfica esté completamente desacoplada de la lógica de negocio y de persistencia.</w:t>
+      </w:r>
+    </w:p>
+    <w:p>
+      <w:pPr>
+        <w:spacing w:line="278" w:lineRule="auto"/>
+      </w:pPr>
+      <w:r>
+        <w:t>El proyecto está estructurado en los siguientes paquetes:</w:t>
+      </w:r>
+    </w:p>
+    <w:p>
+      <w:pPr>
+        <w:numPr>
+          <w:ilvl w:val="0"/>
+          <w:numId w:val="3"/>
+        </w:numPr>
+        <w:spacing w:line="278" w:lineRule="auto"/>
+      </w:pPr>
+      <w:proofErr w:type="spellStart"/>
+      <w:r>
+        <w:lastRenderedPageBreak/>
+        <w:t>db</w:t>
+      </w:r>
+      <w:proofErr w:type="spellEnd"/>
+      <w:r>
+        <w:t>/: Contiene la clase ConexionDB.java, donde centralizo y configuro la conexión a la base de datos MySQL aplicando el patrón </w:t>
+      </w:r>
+      <w:r>
+        <w:rPr>
+          <w:i/>
+          <w:iCs/>
+        </w:rPr>
+        <w:t>Singleton</w:t>
+      </w:r>
+      <w:r>
+        <w:t>.</w:t>
+      </w:r>
+    </w:p>
+    <w:p>
+      <w:pPr>
+        <w:numPr>
+          <w:ilvl w:val="0"/>
+          <w:numId w:val="3"/>
+        </w:numPr>
+        <w:spacing w:line="278" w:lineRule="auto"/>
+      </w:pPr>
+      <w:proofErr w:type="spellStart"/>
+      <w:r>
+        <w:t>model</w:t>
+      </w:r>
+      <w:proofErr w:type="spellEnd"/>
+      <w:r>
+        <w:t>/: Contiene las clases POJO (</w:t>
+      </w:r>
+      <w:r>
+        <w:rPr>
+          <w:i/>
+          <w:iCs/>
+        </w:rPr>
+        <w:t xml:space="preserve">Plain Old Java </w:t>
+      </w:r>
+      <w:proofErr w:type="spellStart"/>
+      <w:r>
+        <w:rPr>
+          <w:i/>
+          <w:iCs/>
+        </w:rPr>
+        <w:t>Object</w:t>
+      </w:r>
+      <w:proofErr w:type="spellEnd"/>
+      <w:r>
+        <w:t>) que representan las entidades principales de mi dominio de negocio (Usuario, Cliente, Pintura, Compra, Empleado).</w:t>
+      </w:r>
+    </w:p>
+    <w:p>
+      <w:pPr>
+        <w:numPr>
+          <w:ilvl w:val="0"/>
+          <w:numId w:val="3"/>
+        </w:numPr>
+        <w:spacing w:line="278" w:lineRule="auto"/>
+      </w:pPr>
+      <w:proofErr w:type="spellStart"/>
+      <w:r>
+        <w:t>dao</w:t>
+      </w:r>
+      <w:proofErr w:type="spellEnd"/>
+      <w:r>
+        <w:t>/: En este paquete he definido las interfaces y sus respectivas implementaciones (ej. </w:t>
+      </w:r>
+      <w:proofErr w:type="spellStart"/>
+      <w:r>
+        <w:t>UsuarioDAO</w:t>
+      </w:r>
+      <w:proofErr w:type="spellEnd"/>
+      <w:r>
+        <w:t>, </w:t>
+      </w:r>
+      <w:proofErr w:type="spellStart"/>
+      <w:r>
+        <w:t>PinturaDAOImpl</w:t>
+      </w:r>
+      <w:proofErr w:type="spellEnd"/>
+      <w:r>
+        <w:t>). Aquí encapsulo todas las consultas y sentencias SQL, utilizando </w:t>
+      </w:r>
+      <w:proofErr w:type="spellStart"/>
+      <w:r>
+        <w:t>PreparedStatement</w:t>
+      </w:r>
+      <w:proofErr w:type="spellEnd"/>
+      <w:r>
+        <w:t> para prevenir ataques de Inyección SQL.</w:t>
+      </w:r>
+    </w:p>
+    <w:p>
+      <w:pPr>
+        <w:numPr>
+          <w:ilvl w:val="0"/>
+          <w:numId w:val="3"/>
+        </w:numPr>
+        <w:spacing w:line="278" w:lineRule="auto"/>
+      </w:pPr>
+      <w:proofErr w:type="spellStart"/>
+      <w:r>
+        <w:t>dto</w:t>
+      </w:r>
+      <w:proofErr w:type="spellEnd"/>
+      <w:r>
+        <w:t>/: He implementado el patrón DTO creando clases como </w:t>
+      </w:r>
+      <w:proofErr w:type="spellStart"/>
+      <w:r>
+        <w:t>CompraDTO</w:t>
+      </w:r>
+      <w:proofErr w:type="spellEnd"/>
+      <w:r>
+        <w:t>, esenciales para agrupar y transferir datos complejos que provienen de consultas con múltiples cruces de tablas (JOIN). Esto evita ensuciar las vistas con lógica de base de datos.</w:t>
+      </w:r>
+    </w:p>
+    <w:p>
+      <w:pPr>
+        <w:numPr>
+          <w:ilvl w:val="0"/>
+          <w:numId w:val="3"/>
+        </w:numPr>
+        <w:spacing w:line="278" w:lineRule="auto"/>
+      </w:pPr>
+      <w:proofErr w:type="spellStart"/>
+      <w:r>
+        <w:t>view</w:t>
+      </w:r>
+      <w:proofErr w:type="spellEnd"/>
+      <w:r>
+        <w:t>/: Agrupa todas las interfaces gráficas de usuario diseñadas en Swing (Login, Registro, Principal).</w:t>
+      </w:r>
+    </w:p>
+    <w:p>
+      <w:pPr>
+        <w:spacing w:line="278" w:lineRule="auto"/>
+        <w:rPr>
+          <w:b/>
+          <w:bCs/>
+        </w:rPr>
+      </w:pPr>
+      <w:r>
+        <w:rPr>
+          <w:b/>
+          <w:bCs/>
+        </w:rPr>
+        <w:t>5. Diseño y Modelo de Base de Datos</w:t>
+      </w:r>
+    </w:p>
+    <w:p>
+      <w:pPr>
+        <w:spacing w:line="278" w:lineRule="auto"/>
+      </w:pPr>
+      <w:r>
+        <w:t>He diseñado un modelo relacional estructurado, aplicando el concepto de </w:t>
+      </w:r>
+      <w:proofErr w:type="spellStart"/>
+      <w:r>
+        <w:rPr>
+          <w:b/>
+          <w:bCs/>
+        </w:rPr>
+        <w:t>Joined</w:t>
+      </w:r>
+      <w:proofErr w:type="spellEnd"/>
+      <w:r>
+        <w:rPr>
+          <w:b/>
+          <w:bCs/>
+        </w:rPr>
+        <w:t xml:space="preserve"> Table </w:t>
+      </w:r>
+      <w:proofErr w:type="spellStart"/>
+      <w:r>
+        <w:rPr>
+          <w:b/>
+          <w:bCs/>
+        </w:rPr>
+        <w:t>Inheritance</w:t>
+      </w:r>
+      <w:proofErr w:type="spellEnd"/>
+      <w:r>
+        <w:t> (Herencia mediante tablas unidas) para modelar de manera eficiente la jerarquía de los usuarios del sistema.</w:t>
+      </w:r>
+    </w:p>
+    <w:p>
+      <w:pPr>
+        <w:numPr>
+          <w:ilvl w:val="0"/>
+          <w:numId w:val="4"/>
+        </w:numPr>
+        <w:spacing w:line="278" w:lineRule="auto"/>
+      </w:pPr>
+      <w:r>
+        <w:rPr>
+          <w:b/>
+          <w:bCs/>
+        </w:rPr>
+        <w:t>Tabla usuarios:</w:t>
+      </w:r>
+      <w:r>
+        <w:t> Es la entidad base. Almacena los datos comunes: username, password, email, nombre, apellidos, dni y rol.</w:t>
+      </w:r>
+    </w:p>
+    <w:p>
+      <w:pPr>
+        <w:numPr>
+          <w:ilvl w:val="0"/>
+          <w:numId w:val="4"/>
+        </w:numPr>
+        <w:spacing w:line="278" w:lineRule="auto"/>
+      </w:pPr>
+      <w:r>
+        <w:rPr>
+          <w:b/>
+          <w:bCs/>
+        </w:rPr>
+        <w:t>Tabla clientes:</w:t>
+      </w:r>
+      <w:r>
+        <w:t> Entidad hija conectada a usuarios mediante </w:t>
+      </w:r>
+      <w:proofErr w:type="spellStart"/>
+      <w:r>
+        <w:t>usuario_id</w:t>
+      </w:r>
+      <w:proofErr w:type="spellEnd"/>
+      <w:r>
+        <w:t> como clave foránea y primaria. Añade el campo </w:t>
+      </w:r>
+      <w:proofErr w:type="spellStart"/>
+      <w:r>
+        <w:t>tipo_cliente</w:t>
+      </w:r>
+      <w:proofErr w:type="spellEnd"/>
+      <w:r>
+        <w:t> (minorista/mayorista). He aplicado la restricción ON DELETE CASCADE para mantener la integridad.</w:t>
+      </w:r>
+    </w:p>
+    <w:p>
+      <w:pPr>
+        <w:numPr>
+          <w:ilvl w:val="0"/>
+          <w:numId w:val="4"/>
+        </w:numPr>
+        <w:spacing w:line="278" w:lineRule="auto"/>
+      </w:pPr>
+      <w:r>
+        <w:rPr>
+          <w:b/>
+          <w:bCs/>
+        </w:rPr>
+        <w:t>Tabla empleados:</w:t>
+      </w:r>
+      <w:r>
+        <w:t> Entidad hija de usuarios que añade los atributos turno y salario. También cuenta con eliminación en cascada.</w:t>
+      </w:r>
+    </w:p>
+    <w:p>
+      <w:pPr>
+        <w:numPr>
+          <w:ilvl w:val="0"/>
+          <w:numId w:val="4"/>
+        </w:numPr>
+        <w:spacing w:line="278" w:lineRule="auto"/>
+      </w:pPr>
+      <w:r>
+        <w:rPr>
+          <w:b/>
+          <w:bCs/>
+        </w:rPr>
+        <w:t>Tabla pinturas:</w:t>
+      </w:r>
+      <w:r>
+        <w:t> Entidad principal del inventario. Almacena la información del producto: nombre, color, tipo, precio y stock.</w:t>
+      </w:r>
+    </w:p>
+    <w:p>
+      <w:pPr>
+        <w:numPr>
+          <w:ilvl w:val="0"/>
+          <w:numId w:val="4"/>
+        </w:numPr>
+        <w:spacing w:line="278" w:lineRule="auto"/>
+      </w:pPr>
+      <w:r>
+        <w:rPr>
+          <w:b/>
+          <w:bCs/>
+        </w:rPr>
+        <w:t>Tabla compras:</w:t>
+      </w:r>
+      <w:r>
+        <w:t> Tabla intermedia que resuelve la relación Muchos-a-Muchos (N:M) entre </w:t>
+      </w:r>
+      <w:r>
+        <w:rPr>
+          <w:i/>
+          <w:iCs/>
+        </w:rPr>
+        <w:t>clientes</w:t>
+      </w:r>
+      <w:r>
+        <w:t> y </w:t>
+      </w:r>
+      <w:r>
+        <w:rPr>
+          <w:i/>
+          <w:iCs/>
+        </w:rPr>
+        <w:t>pinturas</w:t>
+      </w:r>
+      <w:r>
+        <w:t>. Actúa como un registro de transacciones, almacenando la fecha de compra, cantidad adquirida y el coste total.</w:t>
+      </w:r>
+    </w:p>
+    <w:p>
+      <w:pPr>
+        <w:spacing w:line="278" w:lineRule="auto"/>
+        <w:rPr>
+          <w:b/>
+          <w:bCs/>
+        </w:rPr>
+      </w:pPr>
+      <w:r>
+        <w:rPr>
+          <w:b/>
+          <w:bCs/>
+        </w:rPr>
+        <w:t>6. Funcionalidades Clave y Soluciones Técnicas</w:t>
+      </w:r>
+    </w:p>
+    <w:p>
+      <w:pPr>
+        <w:spacing w:line="278" w:lineRule="auto"/>
+      </w:pPr>
+      <w:r>
+        <w:t>6.1. Transacciones Atómicas en Registro</w:t>
+      </w:r>
+    </w:p>
+    <w:p>
+      <w:pPr>
+        <w:spacing w:line="278" w:lineRule="auto"/>
+      </w:pPr>
+      <w:r>
+        <w:t xml:space="preserve">Para el proceso de registro de nuevos clientes y empleados (que involucra insertar primero en usuarios y luego en las tablas hijas), he abandonado el comportamiento por defecto de </w:t>
+      </w:r>
+      <w:proofErr w:type="spellStart"/>
+      <w:r>
+        <w:t>auto-commit</w:t>
+      </w:r>
+      <w:proofErr w:type="spellEnd"/>
+      <w:r>
+        <w:t>. En su lugar, gestiono las transacciones manualmente usando </w:t>
+      </w:r>
+      <w:proofErr w:type="spellStart"/>
+      <w:r>
+        <w:t>con.setAutoCommit</w:t>
+      </w:r>
+      <w:proofErr w:type="spellEnd"/>
+      <w:r>
+        <w:t>(false), </w:t>
+      </w:r>
+      <w:proofErr w:type="spellStart"/>
+      <w:r>
+        <w:t>con.commit</w:t>
+      </w:r>
+      <w:proofErr w:type="spellEnd"/>
+      <w:r>
+        <w:t>() y </w:t>
+      </w:r>
+      <w:proofErr w:type="spellStart"/>
+      <w:r>
+        <w:t>con.rollback</w:t>
+      </w:r>
+      <w:proofErr w:type="spellEnd"/>
+      <w:r>
+        <w:t>(). De esta forma garantizo la atomicidad: si falla la inserción en la tabla hija, se revierte la creación del usuario base, manteniendo la base de datos íntegra y sin registros huérfanos.</w:t>
+      </w:r>
+    </w:p>
+    <w:p>
+      <w:pPr>
+        <w:spacing w:line="278" w:lineRule="auto"/>
+      </w:pPr>
+      <w:r>
+        <w:t>6.2. Separación de Lógica por Roles</w:t>
+      </w:r>
+    </w:p>
+    <w:p>
+      <w:pPr>
+        <w:spacing w:line="278" w:lineRule="auto"/>
+      </w:pPr>
+      <w:r>
+        <w:t xml:space="preserve">La vista Principal detecta dinámicamente qué tipo de usuario ha iniciado sesión. Si el usuario </w:t>
+      </w:r>
+      <w:proofErr w:type="spellStart"/>
+      <w:r>
+        <w:t>logueado</w:t>
+      </w:r>
+      <w:proofErr w:type="spellEnd"/>
+      <w:r>
+        <w:t xml:space="preserve"> es un </w:t>
+      </w:r>
+      <w:r>
+        <w:rPr>
+          <w:b/>
+          <w:bCs/>
+        </w:rPr>
+        <w:t>Cliente</w:t>
+      </w:r>
+      <w:r>
+        <w:t>, el sistema oculta o deshabilita los botones de "Crear producto", "Editar" y "Eliminar". De esta manera, garantizo que los clientes solo interactúen con el catálogo y procedan a comprar.</w:t>
+      </w:r>
+    </w:p>
+    <w:p>
+      <w:pPr>
+        <w:spacing w:line="278" w:lineRule="auto"/>
+      </w:pPr>
+      <w:r>
+        <w:lastRenderedPageBreak/>
+        <w:t>6.3. Automatización de Compras y Control de Stock</w:t>
+      </w:r>
+    </w:p>
+    <w:p>
+      <w:pPr>
+        <w:spacing w:line="278" w:lineRule="auto"/>
+      </w:pPr>
+      <w:r>
+        <w:t>En el panel de compras, he automatizado el cálculo matemático para la comodidad del usuario. Una vez que se selecciona una pintura y una cantidad, el sistema calcula el coste total de la operación cruzando el precio unitario del producto con la demanda solicitada. Además, he codificado que, al confirmar la transacción de compra, no solo se guarde el registro en la tabla compras, sino que inmediatamente lance una consulta UPDATE que resta la cantidad comprada al stock actual de dicha pintura, manteniendo siempre actualizado el inventario.</w:t>
+      </w:r>
+    </w:p>
+    <w:p>
+      <w:pPr>
+        <w:spacing w:line="278" w:lineRule="auto"/>
+        <w:rPr>
+          <w:b/>
+          <w:bCs/>
+        </w:rPr>
+      </w:pPr>
+      <w:r>
+        <w:rPr>
+          <w:b/>
+          <w:bCs/>
+        </w:rPr>
+        <w:t>7. Despliegue y Ejecución</w:t>
+      </w:r>
+    </w:p>
+    <w:p>
+      <w:pPr>
+        <w:spacing w:line="278" w:lineRule="auto"/>
+      </w:pPr>
+      <w:r>
+        <w:t>Para la correcta ejecución e inicialización del proyecto, es necesario:</w:t>
+      </w:r>
+    </w:p>
+    <w:p>
+      <w:pPr>
+        <w:numPr>
+          <w:ilvl w:val="0"/>
+          <w:numId w:val="5"/>
+        </w:numPr>
+        <w:spacing w:line="278" w:lineRule="auto"/>
+      </w:pPr>
+      <w:r>
+        <w:rPr>
+          <w:b/>
+          <w:bCs/>
+        </w:rPr>
+        <w:t>Entorno de Base de datos:</w:t>
+      </w:r>
+      <w:r>
+        <w:t> Levantar un contenedor Docker de MySQL expuesto en el puerto 3307. Posteriormente, ejecutar el script </w:t>
+      </w:r>
+      <w:proofErr w:type="spellStart"/>
+      <w:r>
+        <w:t>database.sql</w:t>
+      </w:r>
+      <w:proofErr w:type="spellEnd"/>
+      <w:r>
+        <w:t> (ubicado en el directorio raíz) que se encarga de estructurar el esquema </w:t>
+      </w:r>
+      <w:proofErr w:type="spellStart"/>
+      <w:r>
+        <w:t>tiendapinturas</w:t>
+      </w:r>
+      <w:proofErr w:type="spellEnd"/>
+      <w:r>
+        <w:t> y rellenarlo con datos semilla de prueba.</w:t>
+      </w:r>
+    </w:p>
+    <w:p>
+      <w:pPr>
+        <w:numPr>
+          <w:ilvl w:val="0"/>
+          <w:numId w:val="5"/>
+        </w:numPr>
+        <w:spacing w:line="278" w:lineRule="auto"/>
+      </w:pPr>
+      <w:r>
+        <w:rPr>
+          <w:b/>
+          <w:bCs/>
+        </w:rPr>
+        <w:t>Configuración del Proyecto IDE:</w:t>
+      </w:r>
+      <w:r>
+        <w:t> Importar el código a un entorno de desarrollo (Eclipse, IntelliJ IDEA, VS Code), y asegurar que el driver mysql-connector-java-8.0.30.jar (ubicado en </w:t>
+      </w:r>
+      <w:proofErr w:type="spellStart"/>
+      <w:r>
+        <w:t>lib</w:t>
+      </w:r>
+      <w:proofErr w:type="spellEnd"/>
+      <w:r>
+        <w:t>/) esté añadido al </w:t>
+      </w:r>
+      <w:proofErr w:type="spellStart"/>
+      <w:r>
+        <w:rPr>
+          <w:i/>
+          <w:iCs/>
+        </w:rPr>
+        <w:t>Build</w:t>
+      </w:r>
+      <w:proofErr w:type="spellEnd"/>
+      <w:r>
+        <w:rPr>
+          <w:i/>
+          <w:iCs/>
+        </w:rPr>
+        <w:t xml:space="preserve"> Path</w:t>
+      </w:r>
+      <w:r>
+        <w:t> del proyecto.</w:t>
+      </w:r>
+    </w:p>
+    <w:p>
+      <w:pPr>
+        <w:numPr>
+          <w:ilvl w:val="0"/>
+          <w:numId w:val="5"/>
+        </w:numPr>
+        <w:spacing w:line="278" w:lineRule="auto"/>
+      </w:pPr>
+      <w:r>
+        <w:rPr>
+          <w:b/>
+          <w:bCs/>
+        </w:rPr>
+        <w:t>Lanzamiento:</w:t>
+      </w:r>
+      <w:r>
+        <w:t> Ejecutar la clase principal Main.java que configura la apariencia inicial y despliega la pantalla de Login.</w:t>
+      </w:r>
+    </w:p>
+    <w:p>
+      <w:pPr>
+        <w:spacing w:line="278" w:lineRule="auto"/>
+        <w:rPr>
+          <w:b/>
+          <w:bCs/>
+        </w:rPr>
+      </w:pPr>
+      <w:r>
+        <w:rPr>
+          <w:b/>
+          <w:bCs/>
+        </w:rPr>
+        <w:t>8. Conclusiones y Futuras Líneas de Mejora</w:t>
+      </w:r>
+    </w:p>
+    <w:p>
+      <w:pPr>
+        <w:spacing w:line="278" w:lineRule="auto"/>
+      </w:pPr>
+      <w:r>
+        <w:t>El desarrollo de la "Tienda de Pinturas" ha culminado en un software funcional que cumple enteramente con las especificaciones iniciales y garantiza una interacción fluida con la base de datos. La implementación de MVC y DAO proporciona un código limpio, ordenado y altamente escalable. Como futuras implementaciones, valoro añadir un módulo de facturación automatizada que genere un PDF (recibo) tras cada compra, y la encriptación asimétrica de las contraseñas de usuario en base de datos.</w:t>
       </w:r>
     </w:p>
     <w:p/>
-    <w:p>
-      <w:r>
-        <w:t>Por favor revise el archivo README.md para leer la documentación completa y detallada.</w:t>
-      </w:r>
-    </w:p>
     <w:sectPr>
       <w:pgSz w:w="11906" w:h="16838"/>
       <w:pgMar w:top="1417" w:right="1701" w:bottom="1417" w:left="1701" w:header="708" w:footer="708" w:gutter="0"/>
@@ -23,22 +1050,749 @@
 </w:document>
 </file>
 
+<file path=word/numbering.xml><?xml version="1.0" encoding="utf-8"?>
+<w:numbering xmlns:wpc="http://schemas.microsoft.com/office/word/2010/wordprocessingCanvas" xmlns:cx="http://schemas.microsoft.com/office/drawing/2014/chartex" xmlns:cx1="http://schemas.microsoft.com/office/drawing/2015/9/8/chartex" xmlns:cx2="http://schemas.microsoft.com/office/drawing/2015/10/21/chartex" xmlns:cx3="http://schemas.microsoft.com/office/drawing/2016/5/9/chartex" xmlns:cx4="http://schemas.microsoft.com/office/drawing/2016/5/10/chartex" xmlns:cx5="http://schemas.microsoft.com/office/drawing/2016/5/11/chartex" xmlns:cx6="http://schemas.microsoft.com/office/drawing/2016/5/12/chartex" xmlns:cx7="http://schemas.microsoft.com/office/drawing/2016/5/13/chartex" xmlns:cx8="http://schemas.microsoft.com/office/drawing/2016/5/14/chartex" xmlns:mc="http://schemas.openxmlformats.org/markup-compatibility/2006" xmlns:aink="http://schemas.microsoft.com/office/drawing/2016/ink" xmlns:am3d="http://schemas.microsoft.com/office/drawing/2017/model3d" xmlns:o="urn:schemas-microsoft-com:office:office" xmlns:oel="http://schemas.microsoft.com/office/2019/extlst" xmlns:r="http://schemas.openxmlformats.org/officeDocument/2006/relationships" xmlns:m="http://schemas.openxmlformats.org/officeDocument/2006/math" xmlns:v="urn:schemas-microsoft-com:vml" xmlns:wp14="http://schemas.microsoft.com/office/word/2010/wordprocessingDrawing" xmlns:wp="http://schemas.openxmlformats.org/drawingml/2006/wordprocessingDrawing" xmlns:w10="urn:schemas-microsoft-com:office:word" xmlns:w="http://schemas.openxmlformats.org/wordprocessingml/2006/main" xmlns:w14="http://schemas.microsoft.com/office/word/2010/wordml" xmlns:w15="http://schemas.microsoft.com/office/word/2012/wordml" xmlns:w16cex="http://schemas.microsoft.com/office/word/2018/wordml/cex" xmlns:w16cid="http://schemas.microsoft.com/office/word/2016/wordml/cid" xmlns:w16="http://schemas.microsoft.com/office/word/2018/wordml" xmlns:w16du="http://schemas.microsoft.com/office/word/2023/wordml/word16du" xmlns:w16sdtdh="http://schemas.microsoft.com/office/word/2020/wordml/sdtdatahash" xmlns:w16sdtfl="http://schemas.microsoft.com/office/word/2024/wordml/sdtformatlock" xmlns:w16se="http://schemas.microsoft.com/office/word/2015/wordml/symex" xmlns:wpg="http://schemas.microsoft.com/office/word/2010/wordprocessingGroup" xmlns:wpi="http://schemas.microsoft.com/office/word/2010/wordprocessingInk" xmlns:wne="http://schemas.microsoft.com/office/word/2006/wordml" xmlns:wps="http://schemas.microsoft.com/office/word/2010/wordprocessingShape" mc:Ignorable="w14 w15 w16se w16cid w16 w16cex w16sdtdh w16sdtfl w16du wp14">
+  <w:abstractNum w:abstractNumId="0" w15:restartNumberingAfterBreak="0">
+    <w:nsid w:val="112434FE"/>
+    <w:multiLevelType w:val="multilevel"/>
+    <w:tmpl w:val="5C664E82"/>
+    <w:lvl w:ilvl="0">
+      <w:start w:val="1"/>
+      <w:numFmt w:val="bullet"/>
+      <w:lvlText w:val=""/>
+      <w:lvlJc w:val="left"/>
+      <w:pPr>
+        <w:tabs>
+          <w:tab w:val="num" w:pos="720"/>
+        </w:tabs>
+        <w:ind w:left="720" w:hanging="360"/>
+      </w:pPr>
+      <w:rPr>
+        <w:rFonts w:ascii="Symbol" w:hAnsi="Symbol" w:hint="default"/>
+        <w:sz w:val="20"/>
+      </w:rPr>
+    </w:lvl>
+    <w:lvl w:ilvl="1" w:tentative="1">
+      <w:start w:val="1"/>
+      <w:numFmt w:val="bullet"/>
+      <w:lvlText w:val=""/>
+      <w:lvlJc w:val="left"/>
+      <w:pPr>
+        <w:tabs>
+          <w:tab w:val="num" w:pos="1440"/>
+        </w:tabs>
+        <w:ind w:left="1440" w:hanging="360"/>
+      </w:pPr>
+      <w:rPr>
+        <w:rFonts w:ascii="Symbol" w:hAnsi="Symbol" w:hint="default"/>
+        <w:sz w:val="20"/>
+      </w:rPr>
+    </w:lvl>
+    <w:lvl w:ilvl="2" w:tentative="1">
+      <w:start w:val="1"/>
+      <w:numFmt w:val="bullet"/>
+      <w:lvlText w:val=""/>
+      <w:lvlJc w:val="left"/>
+      <w:pPr>
+        <w:tabs>
+          <w:tab w:val="num" w:pos="2160"/>
+        </w:tabs>
+        <w:ind w:left="2160" w:hanging="360"/>
+      </w:pPr>
+      <w:rPr>
+        <w:rFonts w:ascii="Symbol" w:hAnsi="Symbol" w:hint="default"/>
+        <w:sz w:val="20"/>
+      </w:rPr>
+    </w:lvl>
+    <w:lvl w:ilvl="3" w:tentative="1">
+      <w:start w:val="1"/>
+      <w:numFmt w:val="bullet"/>
+      <w:lvlText w:val=""/>
+      <w:lvlJc w:val="left"/>
+      <w:pPr>
+        <w:tabs>
+          <w:tab w:val="num" w:pos="2880"/>
+        </w:tabs>
+        <w:ind w:left="2880" w:hanging="360"/>
+      </w:pPr>
+      <w:rPr>
+        <w:rFonts w:ascii="Symbol" w:hAnsi="Symbol" w:hint="default"/>
+        <w:sz w:val="20"/>
+      </w:rPr>
+    </w:lvl>
+    <w:lvl w:ilvl="4" w:tentative="1">
+      <w:start w:val="1"/>
+      <w:numFmt w:val="bullet"/>
+      <w:lvlText w:val=""/>
+      <w:lvlJc w:val="left"/>
+      <w:pPr>
+        <w:tabs>
+          <w:tab w:val="num" w:pos="3600"/>
+        </w:tabs>
+        <w:ind w:left="3600" w:hanging="360"/>
+      </w:pPr>
+      <w:rPr>
+        <w:rFonts w:ascii="Symbol" w:hAnsi="Symbol" w:hint="default"/>
+        <w:sz w:val="20"/>
+      </w:rPr>
+    </w:lvl>
+    <w:lvl w:ilvl="5" w:tentative="1">
+      <w:start w:val="1"/>
+      <w:numFmt w:val="bullet"/>
+      <w:lvlText w:val=""/>
+      <w:lvlJc w:val="left"/>
+      <w:pPr>
+        <w:tabs>
+          <w:tab w:val="num" w:pos="4320"/>
+        </w:tabs>
+        <w:ind w:left="4320" w:hanging="360"/>
+      </w:pPr>
+      <w:rPr>
+        <w:rFonts w:ascii="Symbol" w:hAnsi="Symbol" w:hint="default"/>
+        <w:sz w:val="20"/>
+      </w:rPr>
+    </w:lvl>
+    <w:lvl w:ilvl="6" w:tentative="1">
+      <w:start w:val="1"/>
+      <w:numFmt w:val="bullet"/>
+      <w:lvlText w:val=""/>
+      <w:lvlJc w:val="left"/>
+      <w:pPr>
+        <w:tabs>
+          <w:tab w:val="num" w:pos="5040"/>
+        </w:tabs>
+        <w:ind w:left="5040" w:hanging="360"/>
+      </w:pPr>
+      <w:rPr>
+        <w:rFonts w:ascii="Symbol" w:hAnsi="Symbol" w:hint="default"/>
+        <w:sz w:val="20"/>
+      </w:rPr>
+    </w:lvl>
+    <w:lvl w:ilvl="7" w:tentative="1">
+      <w:start w:val="1"/>
+      <w:numFmt w:val="bullet"/>
+      <w:lvlText w:val=""/>
+      <w:lvlJc w:val="left"/>
+      <w:pPr>
+        <w:tabs>
+          <w:tab w:val="num" w:pos="5760"/>
+        </w:tabs>
+        <w:ind w:left="5760" w:hanging="360"/>
+      </w:pPr>
+      <w:rPr>
+        <w:rFonts w:ascii="Symbol" w:hAnsi="Symbol" w:hint="default"/>
+        <w:sz w:val="20"/>
+      </w:rPr>
+    </w:lvl>
+    <w:lvl w:ilvl="8" w:tentative="1">
+      <w:start w:val="1"/>
+      <w:numFmt w:val="bullet"/>
+      <w:lvlText w:val=""/>
+      <w:lvlJc w:val="left"/>
+      <w:pPr>
+        <w:tabs>
+          <w:tab w:val="num" w:pos="6480"/>
+        </w:tabs>
+        <w:ind w:left="6480" w:hanging="360"/>
+      </w:pPr>
+      <w:rPr>
+        <w:rFonts w:ascii="Symbol" w:hAnsi="Symbol" w:hint="default"/>
+        <w:sz w:val="20"/>
+      </w:rPr>
+    </w:lvl>
+  </w:abstractNum>
+  <w:abstractNum w:abstractNumId="1" w15:restartNumberingAfterBreak="0">
+    <w:nsid w:val="1BAC5931"/>
+    <w:multiLevelType w:val="multilevel"/>
+    <w:tmpl w:val="071634D4"/>
+    <w:lvl w:ilvl="0">
+      <w:start w:val="1"/>
+      <w:numFmt w:val="decimal"/>
+      <w:lvlText w:val="%1."/>
+      <w:lvlJc w:val="left"/>
+      <w:pPr>
+        <w:tabs>
+          <w:tab w:val="num" w:pos="720"/>
+        </w:tabs>
+        <w:ind w:left="720" w:hanging="360"/>
+      </w:pPr>
+    </w:lvl>
+    <w:lvl w:ilvl="1" w:tentative="1">
+      <w:start w:val="1"/>
+      <w:numFmt w:val="decimal"/>
+      <w:lvlText w:val="%2."/>
+      <w:lvlJc w:val="left"/>
+      <w:pPr>
+        <w:tabs>
+          <w:tab w:val="num" w:pos="1440"/>
+        </w:tabs>
+        <w:ind w:left="1440" w:hanging="360"/>
+      </w:pPr>
+    </w:lvl>
+    <w:lvl w:ilvl="2" w:tentative="1">
+      <w:start w:val="1"/>
+      <w:numFmt w:val="decimal"/>
+      <w:lvlText w:val="%3."/>
+      <w:lvlJc w:val="left"/>
+      <w:pPr>
+        <w:tabs>
+          <w:tab w:val="num" w:pos="2160"/>
+        </w:tabs>
+        <w:ind w:left="2160" w:hanging="360"/>
+      </w:pPr>
+    </w:lvl>
+    <w:lvl w:ilvl="3" w:tentative="1">
+      <w:start w:val="1"/>
+      <w:numFmt w:val="decimal"/>
+      <w:lvlText w:val="%4."/>
+      <w:lvlJc w:val="left"/>
+      <w:pPr>
+        <w:tabs>
+          <w:tab w:val="num" w:pos="2880"/>
+        </w:tabs>
+        <w:ind w:left="2880" w:hanging="360"/>
+      </w:pPr>
+    </w:lvl>
+    <w:lvl w:ilvl="4" w:tentative="1">
+      <w:start w:val="1"/>
+      <w:numFmt w:val="decimal"/>
+      <w:lvlText w:val="%5."/>
+      <w:lvlJc w:val="left"/>
+      <w:pPr>
+        <w:tabs>
+          <w:tab w:val="num" w:pos="3600"/>
+        </w:tabs>
+        <w:ind w:left="3600" w:hanging="360"/>
+      </w:pPr>
+    </w:lvl>
+    <w:lvl w:ilvl="5" w:tentative="1">
+      <w:start w:val="1"/>
+      <w:numFmt w:val="decimal"/>
+      <w:lvlText w:val="%6."/>
+      <w:lvlJc w:val="left"/>
+      <w:pPr>
+        <w:tabs>
+          <w:tab w:val="num" w:pos="4320"/>
+        </w:tabs>
+        <w:ind w:left="4320" w:hanging="360"/>
+      </w:pPr>
+    </w:lvl>
+    <w:lvl w:ilvl="6" w:tentative="1">
+      <w:start w:val="1"/>
+      <w:numFmt w:val="decimal"/>
+      <w:lvlText w:val="%7."/>
+      <w:lvlJc w:val="left"/>
+      <w:pPr>
+        <w:tabs>
+          <w:tab w:val="num" w:pos="5040"/>
+        </w:tabs>
+        <w:ind w:left="5040" w:hanging="360"/>
+      </w:pPr>
+    </w:lvl>
+    <w:lvl w:ilvl="7" w:tentative="1">
+      <w:start w:val="1"/>
+      <w:numFmt w:val="decimal"/>
+      <w:lvlText w:val="%8."/>
+      <w:lvlJc w:val="left"/>
+      <w:pPr>
+        <w:tabs>
+          <w:tab w:val="num" w:pos="5760"/>
+        </w:tabs>
+        <w:ind w:left="5760" w:hanging="360"/>
+      </w:pPr>
+    </w:lvl>
+    <w:lvl w:ilvl="8" w:tentative="1">
+      <w:start w:val="1"/>
+      <w:numFmt w:val="decimal"/>
+      <w:lvlText w:val="%9."/>
+      <w:lvlJc w:val="left"/>
+      <w:pPr>
+        <w:tabs>
+          <w:tab w:val="num" w:pos="6480"/>
+        </w:tabs>
+        <w:ind w:left="6480" w:hanging="360"/>
+      </w:pPr>
+    </w:lvl>
+  </w:abstractNum>
+  <w:abstractNum w:abstractNumId="2" w15:restartNumberingAfterBreak="0">
+    <w:nsid w:val="28533573"/>
+    <w:multiLevelType w:val="multilevel"/>
+    <w:tmpl w:val="559CCADC"/>
+    <w:lvl w:ilvl="0">
+      <w:start w:val="1"/>
+      <w:numFmt w:val="bullet"/>
+      <w:lvlText w:val=""/>
+      <w:lvlJc w:val="left"/>
+      <w:pPr>
+        <w:tabs>
+          <w:tab w:val="num" w:pos="720"/>
+        </w:tabs>
+        <w:ind w:left="720" w:hanging="360"/>
+      </w:pPr>
+      <w:rPr>
+        <w:rFonts w:ascii="Symbol" w:hAnsi="Symbol" w:hint="default"/>
+        <w:sz w:val="20"/>
+      </w:rPr>
+    </w:lvl>
+    <w:lvl w:ilvl="1" w:tentative="1">
+      <w:start w:val="1"/>
+      <w:numFmt w:val="bullet"/>
+      <w:lvlText w:val=""/>
+      <w:lvlJc w:val="left"/>
+      <w:pPr>
+        <w:tabs>
+          <w:tab w:val="num" w:pos="1440"/>
+        </w:tabs>
+        <w:ind w:left="1440" w:hanging="360"/>
+      </w:pPr>
+      <w:rPr>
+        <w:rFonts w:ascii="Symbol" w:hAnsi="Symbol" w:hint="default"/>
+        <w:sz w:val="20"/>
+      </w:rPr>
+    </w:lvl>
+    <w:lvl w:ilvl="2" w:tentative="1">
+      <w:start w:val="1"/>
+      <w:numFmt w:val="bullet"/>
+      <w:lvlText w:val=""/>
+      <w:lvlJc w:val="left"/>
+      <w:pPr>
+        <w:tabs>
+          <w:tab w:val="num" w:pos="2160"/>
+        </w:tabs>
+        <w:ind w:left="2160" w:hanging="360"/>
+      </w:pPr>
+      <w:rPr>
+        <w:rFonts w:ascii="Symbol" w:hAnsi="Symbol" w:hint="default"/>
+        <w:sz w:val="20"/>
+      </w:rPr>
+    </w:lvl>
+    <w:lvl w:ilvl="3" w:tentative="1">
+      <w:start w:val="1"/>
+      <w:numFmt w:val="bullet"/>
+      <w:lvlText w:val=""/>
+      <w:lvlJc w:val="left"/>
+      <w:pPr>
+        <w:tabs>
+          <w:tab w:val="num" w:pos="2880"/>
+        </w:tabs>
+        <w:ind w:left="2880" w:hanging="360"/>
+      </w:pPr>
+      <w:rPr>
+        <w:rFonts w:ascii="Symbol" w:hAnsi="Symbol" w:hint="default"/>
+        <w:sz w:val="20"/>
+      </w:rPr>
+    </w:lvl>
+    <w:lvl w:ilvl="4" w:tentative="1">
+      <w:start w:val="1"/>
+      <w:numFmt w:val="bullet"/>
+      <w:lvlText w:val=""/>
+      <w:lvlJc w:val="left"/>
+      <w:pPr>
+        <w:tabs>
+          <w:tab w:val="num" w:pos="3600"/>
+        </w:tabs>
+        <w:ind w:left="3600" w:hanging="360"/>
+      </w:pPr>
+      <w:rPr>
+        <w:rFonts w:ascii="Symbol" w:hAnsi="Symbol" w:hint="default"/>
+        <w:sz w:val="20"/>
+      </w:rPr>
+    </w:lvl>
+    <w:lvl w:ilvl="5" w:tentative="1">
+      <w:start w:val="1"/>
+      <w:numFmt w:val="bullet"/>
+      <w:lvlText w:val=""/>
+      <w:lvlJc w:val="left"/>
+      <w:pPr>
+        <w:tabs>
+          <w:tab w:val="num" w:pos="4320"/>
+        </w:tabs>
+        <w:ind w:left="4320" w:hanging="360"/>
+      </w:pPr>
+      <w:rPr>
+        <w:rFonts w:ascii="Symbol" w:hAnsi="Symbol" w:hint="default"/>
+        <w:sz w:val="20"/>
+      </w:rPr>
+    </w:lvl>
+    <w:lvl w:ilvl="6" w:tentative="1">
+      <w:start w:val="1"/>
+      <w:numFmt w:val="bullet"/>
+      <w:lvlText w:val=""/>
+      <w:lvlJc w:val="left"/>
+      <w:pPr>
+        <w:tabs>
+          <w:tab w:val="num" w:pos="5040"/>
+        </w:tabs>
+        <w:ind w:left="5040" w:hanging="360"/>
+      </w:pPr>
+      <w:rPr>
+        <w:rFonts w:ascii="Symbol" w:hAnsi="Symbol" w:hint="default"/>
+        <w:sz w:val="20"/>
+      </w:rPr>
+    </w:lvl>
+    <w:lvl w:ilvl="7" w:tentative="1">
+      <w:start w:val="1"/>
+      <w:numFmt w:val="bullet"/>
+      <w:lvlText w:val=""/>
+      <w:lvlJc w:val="left"/>
+      <w:pPr>
+        <w:tabs>
+          <w:tab w:val="num" w:pos="5760"/>
+        </w:tabs>
+        <w:ind w:left="5760" w:hanging="360"/>
+      </w:pPr>
+      <w:rPr>
+        <w:rFonts w:ascii="Symbol" w:hAnsi="Symbol" w:hint="default"/>
+        <w:sz w:val="20"/>
+      </w:rPr>
+    </w:lvl>
+    <w:lvl w:ilvl="8" w:tentative="1">
+      <w:start w:val="1"/>
+      <w:numFmt w:val="bullet"/>
+      <w:lvlText w:val=""/>
+      <w:lvlJc w:val="left"/>
+      <w:pPr>
+        <w:tabs>
+          <w:tab w:val="num" w:pos="6480"/>
+        </w:tabs>
+        <w:ind w:left="6480" w:hanging="360"/>
+      </w:pPr>
+      <w:rPr>
+        <w:rFonts w:ascii="Symbol" w:hAnsi="Symbol" w:hint="default"/>
+        <w:sz w:val="20"/>
+      </w:rPr>
+    </w:lvl>
+  </w:abstractNum>
+  <w:abstractNum w:abstractNumId="3" w15:restartNumberingAfterBreak="0">
+    <w:nsid w:val="3DE36DBA"/>
+    <w:multiLevelType w:val="multilevel"/>
+    <w:tmpl w:val="A2620D4A"/>
+    <w:lvl w:ilvl="0">
+      <w:start w:val="1"/>
+      <w:numFmt w:val="bullet"/>
+      <w:lvlText w:val=""/>
+      <w:lvlJc w:val="left"/>
+      <w:pPr>
+        <w:tabs>
+          <w:tab w:val="num" w:pos="720"/>
+        </w:tabs>
+        <w:ind w:left="720" w:hanging="360"/>
+      </w:pPr>
+      <w:rPr>
+        <w:rFonts w:ascii="Symbol" w:hAnsi="Symbol" w:hint="default"/>
+        <w:sz w:val="20"/>
+      </w:rPr>
+    </w:lvl>
+    <w:lvl w:ilvl="1" w:tentative="1">
+      <w:start w:val="1"/>
+      <w:numFmt w:val="bullet"/>
+      <w:lvlText w:val=""/>
+      <w:lvlJc w:val="left"/>
+      <w:pPr>
+        <w:tabs>
+          <w:tab w:val="num" w:pos="1440"/>
+        </w:tabs>
+        <w:ind w:left="1440" w:hanging="360"/>
+      </w:pPr>
+      <w:rPr>
+        <w:rFonts w:ascii="Symbol" w:hAnsi="Symbol" w:hint="default"/>
+        <w:sz w:val="20"/>
+      </w:rPr>
+    </w:lvl>
+    <w:lvl w:ilvl="2" w:tentative="1">
+      <w:start w:val="1"/>
+      <w:numFmt w:val="bullet"/>
+      <w:lvlText w:val=""/>
+      <w:lvlJc w:val="left"/>
+      <w:pPr>
+        <w:tabs>
+          <w:tab w:val="num" w:pos="2160"/>
+        </w:tabs>
+        <w:ind w:left="2160" w:hanging="360"/>
+      </w:pPr>
+      <w:rPr>
+        <w:rFonts w:ascii="Symbol" w:hAnsi="Symbol" w:hint="default"/>
+        <w:sz w:val="20"/>
+      </w:rPr>
+    </w:lvl>
+    <w:lvl w:ilvl="3" w:tentative="1">
+      <w:start w:val="1"/>
+      <w:numFmt w:val="bullet"/>
+      <w:lvlText w:val=""/>
+      <w:lvlJc w:val="left"/>
+      <w:pPr>
+        <w:tabs>
+          <w:tab w:val="num" w:pos="2880"/>
+        </w:tabs>
+        <w:ind w:left="2880" w:hanging="360"/>
+      </w:pPr>
+      <w:rPr>
+        <w:rFonts w:ascii="Symbol" w:hAnsi="Symbol" w:hint="default"/>
+        <w:sz w:val="20"/>
+      </w:rPr>
+    </w:lvl>
+    <w:lvl w:ilvl="4" w:tentative="1">
+      <w:start w:val="1"/>
+      <w:numFmt w:val="bullet"/>
+      <w:lvlText w:val=""/>
+      <w:lvlJc w:val="left"/>
+      <w:pPr>
+        <w:tabs>
+          <w:tab w:val="num" w:pos="3600"/>
+        </w:tabs>
+        <w:ind w:left="3600" w:hanging="360"/>
+      </w:pPr>
+      <w:rPr>
+        <w:rFonts w:ascii="Symbol" w:hAnsi="Symbol" w:hint="default"/>
+        <w:sz w:val="20"/>
+      </w:rPr>
+    </w:lvl>
+    <w:lvl w:ilvl="5" w:tentative="1">
+      <w:start w:val="1"/>
+      <w:numFmt w:val="bullet"/>
+      <w:lvlText w:val=""/>
+      <w:lvlJc w:val="left"/>
+      <w:pPr>
+        <w:tabs>
+          <w:tab w:val="num" w:pos="4320"/>
+        </w:tabs>
+        <w:ind w:left="4320" w:hanging="360"/>
+      </w:pPr>
+      <w:rPr>
+        <w:rFonts w:ascii="Symbol" w:hAnsi="Symbol" w:hint="default"/>
+        <w:sz w:val="20"/>
+      </w:rPr>
+    </w:lvl>
+    <w:lvl w:ilvl="6" w:tentative="1">
+      <w:start w:val="1"/>
+      <w:numFmt w:val="bullet"/>
+      <w:lvlText w:val=""/>
+      <w:lvlJc w:val="left"/>
+      <w:pPr>
+        <w:tabs>
+          <w:tab w:val="num" w:pos="5040"/>
+        </w:tabs>
+        <w:ind w:left="5040" w:hanging="360"/>
+      </w:pPr>
+      <w:rPr>
+        <w:rFonts w:ascii="Symbol" w:hAnsi="Symbol" w:hint="default"/>
+        <w:sz w:val="20"/>
+      </w:rPr>
+    </w:lvl>
+    <w:lvl w:ilvl="7" w:tentative="1">
+      <w:start w:val="1"/>
+      <w:numFmt w:val="bullet"/>
+      <w:lvlText w:val=""/>
+      <w:lvlJc w:val="left"/>
+      <w:pPr>
+        <w:tabs>
+          <w:tab w:val="num" w:pos="5760"/>
+        </w:tabs>
+        <w:ind w:left="5760" w:hanging="360"/>
+      </w:pPr>
+      <w:rPr>
+        <w:rFonts w:ascii="Symbol" w:hAnsi="Symbol" w:hint="default"/>
+        <w:sz w:val="20"/>
+      </w:rPr>
+    </w:lvl>
+    <w:lvl w:ilvl="8" w:tentative="1">
+      <w:start w:val="1"/>
+      <w:numFmt w:val="bullet"/>
+      <w:lvlText w:val=""/>
+      <w:lvlJc w:val="left"/>
+      <w:pPr>
+        <w:tabs>
+          <w:tab w:val="num" w:pos="6480"/>
+        </w:tabs>
+        <w:ind w:left="6480" w:hanging="360"/>
+      </w:pPr>
+      <w:rPr>
+        <w:rFonts w:ascii="Symbol" w:hAnsi="Symbol" w:hint="default"/>
+        <w:sz w:val="20"/>
+      </w:rPr>
+    </w:lvl>
+  </w:abstractNum>
+  <w:abstractNum w:abstractNumId="4" w15:restartNumberingAfterBreak="0">
+    <w:nsid w:val="763E735A"/>
+    <w:multiLevelType w:val="multilevel"/>
+    <w:tmpl w:val="17F0CF9C"/>
+    <w:lvl w:ilvl="0">
+      <w:start w:val="1"/>
+      <w:numFmt w:val="bullet"/>
+      <w:lvlText w:val=""/>
+      <w:lvlJc w:val="left"/>
+      <w:pPr>
+        <w:tabs>
+          <w:tab w:val="num" w:pos="720"/>
+        </w:tabs>
+        <w:ind w:left="720" w:hanging="360"/>
+      </w:pPr>
+      <w:rPr>
+        <w:rFonts w:ascii="Symbol" w:hAnsi="Symbol" w:hint="default"/>
+        <w:sz w:val="20"/>
+      </w:rPr>
+    </w:lvl>
+    <w:lvl w:ilvl="1" w:tentative="1">
+      <w:start w:val="1"/>
+      <w:numFmt w:val="bullet"/>
+      <w:lvlText w:val=""/>
+      <w:lvlJc w:val="left"/>
+      <w:pPr>
+        <w:tabs>
+          <w:tab w:val="num" w:pos="1440"/>
+        </w:tabs>
+        <w:ind w:left="1440" w:hanging="360"/>
+      </w:pPr>
+      <w:rPr>
+        <w:rFonts w:ascii="Symbol" w:hAnsi="Symbol" w:hint="default"/>
+        <w:sz w:val="20"/>
+      </w:rPr>
+    </w:lvl>
+    <w:lvl w:ilvl="2" w:tentative="1">
+      <w:start w:val="1"/>
+      <w:numFmt w:val="bullet"/>
+      <w:lvlText w:val=""/>
+      <w:lvlJc w:val="left"/>
+      <w:pPr>
+        <w:tabs>
+          <w:tab w:val="num" w:pos="2160"/>
+        </w:tabs>
+        <w:ind w:left="2160" w:hanging="360"/>
+      </w:pPr>
+      <w:rPr>
+        <w:rFonts w:ascii="Symbol" w:hAnsi="Symbol" w:hint="default"/>
+        <w:sz w:val="20"/>
+      </w:rPr>
+    </w:lvl>
+    <w:lvl w:ilvl="3" w:tentative="1">
+      <w:start w:val="1"/>
+      <w:numFmt w:val="bullet"/>
+      <w:lvlText w:val=""/>
+      <w:lvlJc w:val="left"/>
+      <w:pPr>
+        <w:tabs>
+          <w:tab w:val="num" w:pos="2880"/>
+        </w:tabs>
+        <w:ind w:left="2880" w:hanging="360"/>
+      </w:pPr>
+      <w:rPr>
+        <w:rFonts w:ascii="Symbol" w:hAnsi="Symbol" w:hint="default"/>
+        <w:sz w:val="20"/>
+      </w:rPr>
+    </w:lvl>
+    <w:lvl w:ilvl="4" w:tentative="1">
+      <w:start w:val="1"/>
+      <w:numFmt w:val="bullet"/>
+      <w:lvlText w:val=""/>
+      <w:lvlJc w:val="left"/>
+      <w:pPr>
+        <w:tabs>
+          <w:tab w:val="num" w:pos="3600"/>
+        </w:tabs>
+        <w:ind w:left="3600" w:hanging="360"/>
+      </w:pPr>
+      <w:rPr>
+        <w:rFonts w:ascii="Symbol" w:hAnsi="Symbol" w:hint="default"/>
+        <w:sz w:val="20"/>
+      </w:rPr>
+    </w:lvl>
+    <w:lvl w:ilvl="5" w:tentative="1">
+      <w:start w:val="1"/>
+      <w:numFmt w:val="bullet"/>
+      <w:lvlText w:val=""/>
+      <w:lvlJc w:val="left"/>
+      <w:pPr>
+        <w:tabs>
+          <w:tab w:val="num" w:pos="4320"/>
+        </w:tabs>
+        <w:ind w:left="4320" w:hanging="360"/>
+      </w:pPr>
+      <w:rPr>
+        <w:rFonts w:ascii="Symbol" w:hAnsi="Symbol" w:hint="default"/>
+        <w:sz w:val="20"/>
+      </w:rPr>
+    </w:lvl>
+    <w:lvl w:ilvl="6" w:tentative="1">
+      <w:start w:val="1"/>
+      <w:numFmt w:val="bullet"/>
+      <w:lvlText w:val=""/>
+      <w:lvlJc w:val="left"/>
+      <w:pPr>
+        <w:tabs>
+          <w:tab w:val="num" w:pos="5040"/>
+        </w:tabs>
+        <w:ind w:left="5040" w:hanging="360"/>
+      </w:pPr>
+      <w:rPr>
+        <w:rFonts w:ascii="Symbol" w:hAnsi="Symbol" w:hint="default"/>
+        <w:sz w:val="20"/>
+      </w:rPr>
+    </w:lvl>
+    <w:lvl w:ilvl="7" w:tentative="1">
+      <w:start w:val="1"/>
+      <w:numFmt w:val="bullet"/>
+      <w:lvlText w:val=""/>
+      <w:lvlJc w:val="left"/>
+      <w:pPr>
+        <w:tabs>
+          <w:tab w:val="num" w:pos="5760"/>
+        </w:tabs>
+        <w:ind w:left="5760" w:hanging="360"/>
+      </w:pPr>
+      <w:rPr>
+        <w:rFonts w:ascii="Symbol" w:hAnsi="Symbol" w:hint="default"/>
+        <w:sz w:val="20"/>
+      </w:rPr>
+    </w:lvl>
+    <w:lvl w:ilvl="8" w:tentative="1">
+      <w:start w:val="1"/>
+      <w:numFmt w:val="bullet"/>
+      <w:lvlText w:val=""/>
+      <w:lvlJc w:val="left"/>
+      <w:pPr>
+        <w:tabs>
+          <w:tab w:val="num" w:pos="6480"/>
+        </w:tabs>
+        <w:ind w:left="6480" w:hanging="360"/>
+      </w:pPr>
+      <w:rPr>
+        <w:rFonts w:ascii="Symbol" w:hAnsi="Symbol" w:hint="default"/>
+        <w:sz w:val="20"/>
+      </w:rPr>
+    </w:lvl>
+  </w:abstractNum>
+  <w:num w:numId="1" w16cid:durableId="1921482248">
+    <w:abstractNumId w:val="2"/>
+  </w:num>
+  <w:num w:numId="2" w16cid:durableId="278609393">
+    <w:abstractNumId w:val="3"/>
+  </w:num>
+  <w:num w:numId="3" w16cid:durableId="613949905">
+    <w:abstractNumId w:val="4"/>
+  </w:num>
+  <w:num w:numId="4" w16cid:durableId="856776213">
+    <w:abstractNumId w:val="0"/>
+  </w:num>
+  <w:num w:numId="5" w16cid:durableId="470367015">
+    <w:abstractNumId w:val="1"/>
+  </w:num>
+</w:numbering>
+</file>
+
 <file path=word/styles.xml><?xml version="1.0" encoding="utf-8"?>
-<w:styles xmlns:mc="http://schemas.openxmlformats.org/markup-compatibility/2006" xmlns:r="http://schemas.openxmlformats.org/officeDocument/2006/relationships" xmlns:w="http://schemas.openxmlformats.org/wordprocessingml/2006/main" xmlns:w14="http://schemas.microsoft.com/office/word/2010/wordml" xmlns:w15="http://schemas.microsoft.com/office/word/2012/wordml" xmlns:w16cex="http://schemas.microsoft.com/office/word/2018/wordml/cex" xmlns:w16cid="http://schemas.microsoft.com/office/word/2016/wordml/cid" xmlns:w16="http://schemas.microsoft.com/office/word/2018/wordml" xmlns:w16sdtdh="http://schemas.microsoft.com/office/word/2020/wordml/sdtdatahash" xmlns:w16se="http://schemas.microsoft.com/office/word/2015/wordml/symex" mc:Ignorable="w14 w15 w16se w16cid w16 w16cex w16sdtdh">
+<w:styles xmlns:mc="http://schemas.openxmlformats.org/markup-compatibility/2006" xmlns:r="http://schemas.openxmlformats.org/officeDocument/2006/relationships" xmlns:w="http://schemas.openxmlformats.org/wordprocessingml/2006/main" xmlns:w14="http://schemas.microsoft.com/office/word/2010/wordml" xmlns:w15="http://schemas.microsoft.com/office/word/2012/wordml" xmlns:w16cex="http://schemas.microsoft.com/office/word/2018/wordml/cex" xmlns:w16cid="http://schemas.microsoft.com/office/word/2016/wordml/cid" xmlns:w16="http://schemas.microsoft.com/office/word/2018/wordml" xmlns:w16du="http://schemas.microsoft.com/office/word/2023/wordml/word16du" xmlns:w16sdtdh="http://schemas.microsoft.com/office/word/2020/wordml/sdtdatahash" xmlns:w16sdtfl="http://schemas.microsoft.com/office/word/2024/wordml/sdtformatlock" xmlns:w16se="http://schemas.microsoft.com/office/word/2015/wordml/symex" mc:Ignorable="w14 w15 w16se w16cid w16 w16cex w16sdtdh w16sdtfl w16du">
   <w:docDefaults>
     <w:rPrDefault>
       <w:rPr>
-        <w:rFonts w:asciiTheme="minorHAnsi" w:eastAsiaTheme="minorHAnsi" w:hAnsiTheme="minorHAnsi" w:cstheme="minorBidi"/>
-        <w:kern w:val="2"/>
-        <w:sz w:val="24"/>
-        <w:szCs w:val="24"/>
+        <w:rFonts w:asciiTheme="minorHAnsi" w:eastAsiaTheme="minorEastAsia" w:hAnsiTheme="minorHAnsi" w:cstheme="minorBidi"/>
+        <w:sz w:val="21"/>
+        <w:szCs w:val="21"/>
         <w:lang w:val="es-ES" w:eastAsia="en-US" w:bidi="ar-SA"/>
-        <w14:ligatures w14:val="standardContextual"/>
       </w:rPr>
     </w:rPrDefault>
     <w:pPrDefault>
       <w:pPr>
-        <w:spacing w:after="160" w:line="278" w:lineRule="auto"/>
+        <w:spacing w:after="160" w:line="312" w:lineRule="auto"/>
       </w:pPr>
     </w:pPrDefault>
   </w:docDefaults>
@@ -423,6 +2177,7 @@
   <w:style w:type="paragraph" w:default="1" w:styleId="Normal">
     <w:name w:val="Normal"/>
     <w:qFormat/>
+    <w:rsid w:val="00EF46A4"/>
   </w:style>
   <w:style w:type="paragraph" w:styleId="Ttulo1">
     <w:name w:val="heading 1"/>
@@ -431,18 +2186,22 @@
     <w:link w:val="Ttulo1Car"/>
     <w:uiPriority w:val="9"/>
     <w:qFormat/>
-    <w:rsid w:val="006B2101"/>
+    <w:rsid w:val="00EF46A4"/>
     <w:pPr>
       <w:keepNext/>
       <w:keepLines/>
-      <w:spacing w:before="360" w:after="80"/>
+      <w:pBdr>
+        <w:left w:val="single" w:sz="12" w:space="12" w:color="4BCAAD" w:themeColor="accent2"/>
+      </w:pBdr>
+      <w:spacing w:before="80" w:after="80" w:line="240" w:lineRule="auto"/>
       <w:outlineLvl w:val="0"/>
     </w:pPr>
     <w:rPr>
       <w:rFonts w:asciiTheme="majorHAnsi" w:eastAsiaTheme="majorEastAsia" w:hAnsiTheme="majorHAnsi" w:cstheme="majorBidi"/>
-      <w:color w:val="0F4761" w:themeColor="accent1" w:themeShade="BF"/>
-      <w:sz w:val="40"/>
-      <w:szCs w:val="40"/>
+      <w:caps/>
+      <w:spacing w:val="10"/>
+      <w:sz w:val="36"/>
+      <w:szCs w:val="36"/>
     </w:rPr>
   </w:style>
   <w:style w:type="paragraph" w:styleId="Ttulo2">
@@ -454,18 +2213,17 @@
     <w:semiHidden/>
     <w:unhideWhenUsed/>
     <w:qFormat/>
-    <w:rsid w:val="006B2101"/>
+    <w:rsid w:val="00EF46A4"/>
     <w:pPr>
       <w:keepNext/>
       <w:keepLines/>
-      <w:spacing w:before="160" w:after="80"/>
+      <w:spacing w:before="120" w:after="0" w:line="240" w:lineRule="auto"/>
       <w:outlineLvl w:val="1"/>
     </w:pPr>
     <w:rPr>
       <w:rFonts w:asciiTheme="majorHAnsi" w:eastAsiaTheme="majorEastAsia" w:hAnsiTheme="majorHAnsi" w:cstheme="majorBidi"/>
-      <w:color w:val="0F4761" w:themeColor="accent1" w:themeShade="BF"/>
-      <w:sz w:val="32"/>
-      <w:szCs w:val="32"/>
+      <w:sz w:val="36"/>
+      <w:szCs w:val="36"/>
     </w:rPr>
   </w:style>
   <w:style w:type="paragraph" w:styleId="Ttulo3">
@@ -477,16 +2235,16 @@
     <w:semiHidden/>
     <w:unhideWhenUsed/>
     <w:qFormat/>
-    <w:rsid w:val="006B2101"/>
+    <w:rsid w:val="00EF46A4"/>
     <w:pPr>
       <w:keepNext/>
       <w:keepLines/>
-      <w:spacing w:before="160" w:after="80"/>
+      <w:spacing w:before="80" w:after="0" w:line="240" w:lineRule="auto"/>
       <w:outlineLvl w:val="2"/>
     </w:pPr>
     <w:rPr>
-      <w:rFonts w:eastAsiaTheme="majorEastAsia" w:cstheme="majorBidi"/>
-      <w:color w:val="0F4761" w:themeColor="accent1" w:themeShade="BF"/>
+      <w:rFonts w:asciiTheme="majorHAnsi" w:eastAsiaTheme="majorEastAsia" w:hAnsiTheme="majorHAnsi" w:cstheme="majorBidi"/>
+      <w:caps/>
       <w:sz w:val="28"/>
       <w:szCs w:val="28"/>
     </w:rPr>
@@ -500,18 +2258,19 @@
     <w:semiHidden/>
     <w:unhideWhenUsed/>
     <w:qFormat/>
-    <w:rsid w:val="006B2101"/>
+    <w:rsid w:val="00EF46A4"/>
     <w:pPr>
       <w:keepNext/>
       <w:keepLines/>
-      <w:spacing w:before="80" w:after="40"/>
+      <w:spacing w:before="80" w:after="0" w:line="240" w:lineRule="auto"/>
       <w:outlineLvl w:val="3"/>
     </w:pPr>
     <w:rPr>
-      <w:rFonts w:eastAsiaTheme="majorEastAsia" w:cstheme="majorBidi"/>
+      <w:rFonts w:asciiTheme="majorHAnsi" w:eastAsiaTheme="majorEastAsia" w:hAnsiTheme="majorHAnsi" w:cstheme="majorBidi"/>
       <w:i/>
       <w:iCs/>
-      <w:color w:val="0F4761" w:themeColor="accent1" w:themeShade="BF"/>
+      <w:sz w:val="28"/>
+      <w:szCs w:val="28"/>
     </w:rPr>
   </w:style>
   <w:style w:type="paragraph" w:styleId="Ttulo5">
@@ -523,16 +2282,17 @@
     <w:semiHidden/>
     <w:unhideWhenUsed/>
     <w:qFormat/>
-    <w:rsid w:val="006B2101"/>
+    <w:rsid w:val="00EF46A4"/>
     <w:pPr>
       <w:keepNext/>
       <w:keepLines/>
-      <w:spacing w:before="80" w:after="40"/>
+      <w:spacing w:before="80" w:after="0" w:line="240" w:lineRule="auto"/>
       <w:outlineLvl w:val="4"/>
     </w:pPr>
     <w:rPr>
-      <w:rFonts w:eastAsiaTheme="majorEastAsia" w:cstheme="majorBidi"/>
-      <w:color w:val="0F4761" w:themeColor="accent1" w:themeShade="BF"/>
+      <w:rFonts w:asciiTheme="majorHAnsi" w:eastAsiaTheme="majorEastAsia" w:hAnsiTheme="majorHAnsi" w:cstheme="majorBidi"/>
+      <w:sz w:val="24"/>
+      <w:szCs w:val="24"/>
     </w:rPr>
   </w:style>
   <w:style w:type="paragraph" w:styleId="Ttulo6">
@@ -544,18 +2304,19 @@
     <w:semiHidden/>
     <w:unhideWhenUsed/>
     <w:qFormat/>
-    <w:rsid w:val="006B2101"/>
+    <w:rsid w:val="00EF46A4"/>
     <w:pPr>
       <w:keepNext/>
       <w:keepLines/>
-      <w:spacing w:before="40" w:after="0"/>
+      <w:spacing w:before="80" w:after="0" w:line="240" w:lineRule="auto"/>
       <w:outlineLvl w:val="5"/>
     </w:pPr>
     <w:rPr>
-      <w:rFonts w:eastAsiaTheme="majorEastAsia" w:cstheme="majorBidi"/>
+      <w:rFonts w:asciiTheme="majorHAnsi" w:eastAsiaTheme="majorEastAsia" w:hAnsiTheme="majorHAnsi" w:cstheme="majorBidi"/>
       <w:i/>
       <w:iCs/>
-      <w:color w:val="595959" w:themeColor="text1" w:themeTint="A6"/>
+      <w:sz w:val="24"/>
+      <w:szCs w:val="24"/>
     </w:rPr>
   </w:style>
   <w:style w:type="paragraph" w:styleId="Ttulo7">
@@ -567,16 +2328,18 @@
     <w:semiHidden/>
     <w:unhideWhenUsed/>
     <w:qFormat/>
-    <w:rsid w:val="006B2101"/>
+    <w:rsid w:val="00EF46A4"/>
     <w:pPr>
       <w:keepNext/>
       <w:keepLines/>
-      <w:spacing w:before="40" w:after="0"/>
+      <w:spacing w:before="80" w:after="0" w:line="240" w:lineRule="auto"/>
       <w:outlineLvl w:val="6"/>
     </w:pPr>
     <w:rPr>
-      <w:rFonts w:eastAsiaTheme="majorEastAsia" w:cstheme="majorBidi"/>
+      <w:rFonts w:asciiTheme="majorHAnsi" w:eastAsiaTheme="majorEastAsia" w:hAnsiTheme="majorHAnsi" w:cstheme="majorBidi"/>
       <w:color w:val="595959" w:themeColor="text1" w:themeTint="A6"/>
+      <w:sz w:val="24"/>
+      <w:szCs w:val="24"/>
     </w:rPr>
   </w:style>
   <w:style w:type="paragraph" w:styleId="Ttulo8">
@@ -588,18 +2351,16 @@
     <w:semiHidden/>
     <w:unhideWhenUsed/>
     <w:qFormat/>
-    <w:rsid w:val="006B2101"/>
+    <w:rsid w:val="00EF46A4"/>
     <w:pPr>
       <w:keepNext/>
       <w:keepLines/>
-      <w:spacing w:after="0"/>
+      <w:spacing w:before="80" w:after="0" w:line="240" w:lineRule="auto"/>
       <w:outlineLvl w:val="7"/>
     </w:pPr>
     <w:rPr>
-      <w:rFonts w:eastAsiaTheme="majorEastAsia" w:cstheme="majorBidi"/>
-      <w:i/>
-      <w:iCs/>
-      <w:color w:val="272727" w:themeColor="text1" w:themeTint="D8"/>
+      <w:rFonts w:asciiTheme="majorHAnsi" w:eastAsiaTheme="majorEastAsia" w:hAnsiTheme="majorHAnsi" w:cstheme="majorBidi"/>
+      <w:caps/>
     </w:rPr>
   </w:style>
   <w:style w:type="paragraph" w:styleId="Ttulo9">
@@ -611,22 +2372,23 @@
     <w:semiHidden/>
     <w:unhideWhenUsed/>
     <w:qFormat/>
-    <w:rsid w:val="006B2101"/>
+    <w:rsid w:val="00EF46A4"/>
     <w:pPr>
       <w:keepNext/>
       <w:keepLines/>
-      <w:spacing w:after="0"/>
+      <w:spacing w:before="80" w:after="0" w:line="240" w:lineRule="auto"/>
       <w:outlineLvl w:val="8"/>
     </w:pPr>
     <w:rPr>
-      <w:rFonts w:eastAsiaTheme="majorEastAsia" w:cstheme="majorBidi"/>
-      <w:color w:val="272727" w:themeColor="text1" w:themeTint="D8"/>
+      <w:rFonts w:asciiTheme="majorHAnsi" w:eastAsiaTheme="majorEastAsia" w:hAnsiTheme="majorHAnsi" w:cstheme="majorBidi"/>
+      <w:i/>
+      <w:iCs/>
+      <w:caps/>
     </w:rPr>
   </w:style>
   <w:style w:type="character" w:default="1" w:styleId="Fuentedeprrafopredeter">
     <w:name w:val="Default Paragraph Font"/>
     <w:uiPriority w:val="1"/>
-    <w:semiHidden/>
     <w:unhideWhenUsed/>
   </w:style>
   <w:style w:type="table" w:default="1" w:styleId="Tablanormal">
@@ -655,12 +2417,13 @@
     <w:basedOn w:val="Fuentedeprrafopredeter"/>
     <w:link w:val="Ttulo1"/>
     <w:uiPriority w:val="9"/>
-    <w:rsid w:val="006B2101"/>
+    <w:rsid w:val="00EF46A4"/>
     <w:rPr>
       <w:rFonts w:asciiTheme="majorHAnsi" w:eastAsiaTheme="majorEastAsia" w:hAnsiTheme="majorHAnsi" w:cstheme="majorBidi"/>
-      <w:color w:val="0F4761" w:themeColor="accent1" w:themeShade="BF"/>
-      <w:sz w:val="40"/>
-      <w:szCs w:val="40"/>
+      <w:caps/>
+      <w:spacing w:val="10"/>
+      <w:sz w:val="36"/>
+      <w:szCs w:val="36"/>
     </w:rPr>
   </w:style>
   <w:style w:type="character" w:customStyle="1" w:styleId="Ttulo2Car">
@@ -669,12 +2432,11 @@
     <w:link w:val="Ttulo2"/>
     <w:uiPriority w:val="9"/>
     <w:semiHidden/>
-    <w:rsid w:val="006B2101"/>
+    <w:rsid w:val="00EF46A4"/>
     <w:rPr>
       <w:rFonts w:asciiTheme="majorHAnsi" w:eastAsiaTheme="majorEastAsia" w:hAnsiTheme="majorHAnsi" w:cstheme="majorBidi"/>
-      <w:color w:val="0F4761" w:themeColor="accent1" w:themeShade="BF"/>
-      <w:sz w:val="32"/>
-      <w:szCs w:val="32"/>
+      <w:sz w:val="36"/>
+      <w:szCs w:val="36"/>
     </w:rPr>
   </w:style>
   <w:style w:type="character" w:customStyle="1" w:styleId="Ttulo3Car">
@@ -683,10 +2445,10 @@
     <w:link w:val="Ttulo3"/>
     <w:uiPriority w:val="9"/>
     <w:semiHidden/>
-    <w:rsid w:val="006B2101"/>
-    <w:rPr>
-      <w:rFonts w:eastAsiaTheme="majorEastAsia" w:cstheme="majorBidi"/>
-      <w:color w:val="0F4761" w:themeColor="accent1" w:themeShade="BF"/>
+    <w:rsid w:val="00EF46A4"/>
+    <w:rPr>
+      <w:rFonts w:asciiTheme="majorHAnsi" w:eastAsiaTheme="majorEastAsia" w:hAnsiTheme="majorHAnsi" w:cstheme="majorBidi"/>
+      <w:caps/>
       <w:sz w:val="28"/>
       <w:szCs w:val="28"/>
     </w:rPr>
@@ -697,12 +2459,13 @@
     <w:link w:val="Ttulo4"/>
     <w:uiPriority w:val="9"/>
     <w:semiHidden/>
-    <w:rsid w:val="006B2101"/>
-    <w:rPr>
-      <w:rFonts w:eastAsiaTheme="majorEastAsia" w:cstheme="majorBidi"/>
+    <w:rsid w:val="00EF46A4"/>
+    <w:rPr>
+      <w:rFonts w:asciiTheme="majorHAnsi" w:eastAsiaTheme="majorEastAsia" w:hAnsiTheme="majorHAnsi" w:cstheme="majorBidi"/>
       <w:i/>
       <w:iCs/>
-      <w:color w:val="0F4761" w:themeColor="accent1" w:themeShade="BF"/>
+      <w:sz w:val="28"/>
+      <w:szCs w:val="28"/>
     </w:rPr>
   </w:style>
   <w:style w:type="character" w:customStyle="1" w:styleId="Ttulo5Car">
@@ -711,10 +2474,11 @@
     <w:link w:val="Ttulo5"/>
     <w:uiPriority w:val="9"/>
     <w:semiHidden/>
-    <w:rsid w:val="006B2101"/>
-    <w:rPr>
-      <w:rFonts w:eastAsiaTheme="majorEastAsia" w:cstheme="majorBidi"/>
-      <w:color w:val="0F4761" w:themeColor="accent1" w:themeShade="BF"/>
+    <w:rsid w:val="00EF46A4"/>
+    <w:rPr>
+      <w:rFonts w:asciiTheme="majorHAnsi" w:eastAsiaTheme="majorEastAsia" w:hAnsiTheme="majorHAnsi" w:cstheme="majorBidi"/>
+      <w:sz w:val="24"/>
+      <w:szCs w:val="24"/>
     </w:rPr>
   </w:style>
   <w:style w:type="character" w:customStyle="1" w:styleId="Ttulo6Car">
@@ -723,12 +2487,13 @@
     <w:link w:val="Ttulo6"/>
     <w:uiPriority w:val="9"/>
     <w:semiHidden/>
-    <w:rsid w:val="006B2101"/>
-    <w:rPr>
-      <w:rFonts w:eastAsiaTheme="majorEastAsia" w:cstheme="majorBidi"/>
+    <w:rsid w:val="00EF46A4"/>
+    <w:rPr>
+      <w:rFonts w:asciiTheme="majorHAnsi" w:eastAsiaTheme="majorEastAsia" w:hAnsiTheme="majorHAnsi" w:cstheme="majorBidi"/>
       <w:i/>
       <w:iCs/>
-      <w:color w:val="595959" w:themeColor="text1" w:themeTint="A6"/>
+      <w:sz w:val="24"/>
+      <w:szCs w:val="24"/>
     </w:rPr>
   </w:style>
   <w:style w:type="character" w:customStyle="1" w:styleId="Ttulo7Car">
@@ -737,10 +2502,12 @@
     <w:link w:val="Ttulo7"/>
     <w:uiPriority w:val="9"/>
     <w:semiHidden/>
-    <w:rsid w:val="006B2101"/>
-    <w:rPr>
-      <w:rFonts w:eastAsiaTheme="majorEastAsia" w:cstheme="majorBidi"/>
+    <w:rsid w:val="00EF46A4"/>
+    <w:rPr>
+      <w:rFonts w:asciiTheme="majorHAnsi" w:eastAsiaTheme="majorEastAsia" w:hAnsiTheme="majorHAnsi" w:cstheme="majorBidi"/>
       <w:color w:val="595959" w:themeColor="text1" w:themeTint="A6"/>
+      <w:sz w:val="24"/>
+      <w:szCs w:val="24"/>
     </w:rPr>
   </w:style>
   <w:style w:type="character" w:customStyle="1" w:styleId="Ttulo8Car">
@@ -749,12 +2516,10 @@
     <w:link w:val="Ttulo8"/>
     <w:uiPriority w:val="9"/>
     <w:semiHidden/>
-    <w:rsid w:val="006B2101"/>
-    <w:rPr>
-      <w:rFonts w:eastAsiaTheme="majorEastAsia" w:cstheme="majorBidi"/>
-      <w:i/>
-      <w:iCs/>
-      <w:color w:val="272727" w:themeColor="text1" w:themeTint="D8"/>
+    <w:rsid w:val="00EF46A4"/>
+    <w:rPr>
+      <w:rFonts w:asciiTheme="majorHAnsi" w:eastAsiaTheme="majorEastAsia" w:hAnsiTheme="majorHAnsi" w:cstheme="majorBidi"/>
+      <w:caps/>
     </w:rPr>
   </w:style>
   <w:style w:type="character" w:customStyle="1" w:styleId="Ttulo9Car">
@@ -763,10 +2528,12 @@
     <w:link w:val="Ttulo9"/>
     <w:uiPriority w:val="9"/>
     <w:semiHidden/>
-    <w:rsid w:val="006B2101"/>
-    <w:rPr>
-      <w:rFonts w:eastAsiaTheme="majorEastAsia" w:cstheme="majorBidi"/>
-      <w:color w:val="272727" w:themeColor="text1" w:themeTint="D8"/>
+    <w:rsid w:val="00EF46A4"/>
+    <w:rPr>
+      <w:rFonts w:asciiTheme="majorHAnsi" w:eastAsiaTheme="majorEastAsia" w:hAnsiTheme="majorHAnsi" w:cstheme="majorBidi"/>
+      <w:i/>
+      <w:iCs/>
+      <w:caps/>
     </w:rPr>
   </w:style>
   <w:style w:type="paragraph" w:styleId="Ttulo">
@@ -776,17 +2543,17 @@
     <w:link w:val="TtuloCar"/>
     <w:uiPriority w:val="10"/>
     <w:qFormat/>
-    <w:rsid w:val="006B2101"/>
+    <w:rsid w:val="00EF46A4"/>
     <w:pPr>
-      <w:spacing w:after="80" w:line="240" w:lineRule="auto"/>
+      <w:spacing w:after="0" w:line="240" w:lineRule="auto"/>
       <w:contextualSpacing/>
     </w:pPr>
     <w:rPr>
       <w:rFonts w:asciiTheme="majorHAnsi" w:eastAsiaTheme="majorEastAsia" w:hAnsiTheme="majorHAnsi" w:cstheme="majorBidi"/>
-      <w:spacing w:val="-10"/>
-      <w:kern w:val="28"/>
-      <w:sz w:val="56"/>
-      <w:szCs w:val="56"/>
+      <w:caps/>
+      <w:spacing w:val="40"/>
+      <w:sz w:val="76"/>
+      <w:szCs w:val="76"/>
     </w:rPr>
   </w:style>
   <w:style w:type="character" w:customStyle="1" w:styleId="TtuloCar">
@@ -794,13 +2561,13 @@
     <w:basedOn w:val="Fuentedeprrafopredeter"/>
     <w:link w:val="Ttulo"/>
     <w:uiPriority w:val="10"/>
-    <w:rsid w:val="006B2101"/>
+    <w:rsid w:val="00EF46A4"/>
     <w:rPr>
       <w:rFonts w:asciiTheme="majorHAnsi" w:eastAsiaTheme="majorEastAsia" w:hAnsiTheme="majorHAnsi" w:cstheme="majorBidi"/>
-      <w:spacing w:val="-10"/>
-      <w:kern w:val="28"/>
-      <w:sz w:val="56"/>
-      <w:szCs w:val="56"/>
+      <w:caps/>
+      <w:spacing w:val="40"/>
+      <w:sz w:val="76"/>
+      <w:szCs w:val="76"/>
     </w:rPr>
   </w:style>
   <w:style w:type="paragraph" w:styleId="Subttulo">
@@ -810,18 +2577,17 @@
     <w:link w:val="SubttuloCar"/>
     <w:uiPriority w:val="11"/>
     <w:qFormat/>
-    <w:rsid w:val="006B2101"/>
+    <w:rsid w:val="00EF46A4"/>
     <w:pPr>
       <w:numPr>
         <w:ilvl w:val="1"/>
       </w:numPr>
+      <w:spacing w:after="240"/>
     </w:pPr>
     <w:rPr>
-      <w:rFonts w:eastAsiaTheme="majorEastAsia" w:cstheme="majorBidi"/>
-      <w:color w:val="595959" w:themeColor="text1" w:themeTint="A6"/>
-      <w:spacing w:val="15"/>
-      <w:sz w:val="28"/>
-      <w:szCs w:val="28"/>
+      <w:color w:val="000000" w:themeColor="text1"/>
+      <w:sz w:val="24"/>
+      <w:szCs w:val="24"/>
     </w:rPr>
   </w:style>
   <w:style w:type="character" w:customStyle="1" w:styleId="SubttuloCar">
@@ -829,13 +2595,11 @@
     <w:basedOn w:val="Fuentedeprrafopredeter"/>
     <w:link w:val="Subttulo"/>
     <w:uiPriority w:val="11"/>
-    <w:rsid w:val="006B2101"/>
-    <w:rPr>
-      <w:rFonts w:eastAsiaTheme="majorEastAsia" w:cstheme="majorBidi"/>
-      <w:color w:val="595959" w:themeColor="text1" w:themeTint="A6"/>
-      <w:spacing w:val="15"/>
-      <w:sz w:val="28"/>
-      <w:szCs w:val="28"/>
+    <w:rsid w:val="00EF46A4"/>
+    <w:rPr>
+      <w:color w:val="000000" w:themeColor="text1"/>
+      <w:sz w:val="24"/>
+      <w:szCs w:val="24"/>
     </w:rPr>
   </w:style>
   <w:style w:type="paragraph" w:styleId="Cita">
@@ -845,15 +2609,15 @@
     <w:link w:val="CitaCar"/>
     <w:uiPriority w:val="29"/>
     <w:qFormat/>
-    <w:rsid w:val="006B2101"/>
+    <w:rsid w:val="00EF46A4"/>
     <w:pPr>
       <w:spacing w:before="160"/>
-      <w:jc w:val="center"/>
+      <w:ind w:left="720"/>
     </w:pPr>
     <w:rPr>
-      <w:i/>
-      <w:iCs/>
-      <w:color w:val="404040" w:themeColor="text1" w:themeTint="BF"/>
+      <w:rFonts w:asciiTheme="majorHAnsi" w:eastAsiaTheme="majorEastAsia" w:hAnsiTheme="majorHAnsi" w:cstheme="majorBidi"/>
+      <w:sz w:val="24"/>
+      <w:szCs w:val="24"/>
     </w:rPr>
   </w:style>
   <w:style w:type="character" w:customStyle="1" w:styleId="CitaCar">
@@ -861,11 +2625,11 @@
     <w:basedOn w:val="Fuentedeprrafopredeter"/>
     <w:link w:val="Cita"/>
     <w:uiPriority w:val="29"/>
-    <w:rsid w:val="006B2101"/>
-    <w:rPr>
-      <w:i/>
-      <w:iCs/>
-      <w:color w:val="404040" w:themeColor="text1" w:themeTint="BF"/>
+    <w:rsid w:val="00EF46A4"/>
+    <w:rPr>
+      <w:rFonts w:asciiTheme="majorHAnsi" w:eastAsiaTheme="majorEastAsia" w:hAnsiTheme="majorHAnsi" w:cstheme="majorBidi"/>
+      <w:sz w:val="24"/>
+      <w:szCs w:val="24"/>
     </w:rPr>
   </w:style>
   <w:style w:type="paragraph" w:styleId="Prrafodelista">
@@ -884,11 +2648,19 @@
     <w:basedOn w:val="Fuentedeprrafopredeter"/>
     <w:uiPriority w:val="21"/>
     <w:qFormat/>
-    <w:rsid w:val="006B2101"/>
-    <w:rPr>
+    <w:rsid w:val="00EF46A4"/>
+    <w:rPr>
+      <w:rFonts w:asciiTheme="minorHAnsi" w:eastAsiaTheme="minorEastAsia" w:hAnsiTheme="minorHAnsi" w:cstheme="minorBidi"/>
+      <w:b/>
+      <w:bCs/>
       <w:i/>
       <w:iCs/>
-      <w:color w:val="0F4761" w:themeColor="accent1" w:themeShade="BF"/>
+      <w:color w:val="2FA085" w:themeColor="accent2" w:themeShade="BF"/>
+      <w:spacing w:val="0"/>
+      <w:w w:val="100"/>
+      <w:position w:val="0"/>
+      <w:sz w:val="20"/>
+      <w:szCs w:val="20"/>
     </w:rPr>
   </w:style>
   <w:style w:type="paragraph" w:styleId="Citadestacada">
@@ -898,20 +2670,19 @@
     <w:link w:val="CitadestacadaCar"/>
     <w:uiPriority w:val="30"/>
     <w:qFormat/>
-    <w:rsid w:val="006B2101"/>
+    <w:rsid w:val="00EF46A4"/>
     <w:pPr>
-      <w:pBdr>
-        <w:top w:val="single" w:sz="4" w:space="10" w:color="0F4761" w:themeColor="accent1" w:themeShade="BF"/>
-        <w:bottom w:val="single" w:sz="4" w:space="10" w:color="0F4761" w:themeColor="accent1" w:themeShade="BF"/>
-      </w:pBdr>
-      <w:spacing w:before="360" w:after="360"/>
-      <w:ind w:left="864" w:right="864"/>
+      <w:spacing w:before="100" w:beforeAutospacing="1" w:after="240"/>
+      <w:ind w:left="936" w:right="936"/>
       <w:jc w:val="center"/>
     </w:pPr>
     <w:rPr>
-      <w:i/>
-      <w:iCs/>
-      <w:color w:val="0F4761" w:themeColor="accent1" w:themeShade="BF"/>
+      <w:rFonts w:asciiTheme="majorHAnsi" w:eastAsiaTheme="majorEastAsia" w:hAnsiTheme="majorHAnsi" w:cstheme="majorBidi"/>
+      <w:caps/>
+      <w:color w:val="2FA085" w:themeColor="accent2" w:themeShade="BF"/>
+      <w:spacing w:val="10"/>
+      <w:sz w:val="28"/>
+      <w:szCs w:val="28"/>
     </w:rPr>
   </w:style>
   <w:style w:type="character" w:customStyle="1" w:styleId="CitadestacadaCar">
@@ -919,11 +2690,14 @@
     <w:basedOn w:val="Fuentedeprrafopredeter"/>
     <w:link w:val="Citadestacada"/>
     <w:uiPriority w:val="30"/>
-    <w:rsid w:val="006B2101"/>
-    <w:rPr>
-      <w:i/>
-      <w:iCs/>
-      <w:color w:val="0F4761" w:themeColor="accent1" w:themeShade="BF"/>
+    <w:rsid w:val="00EF46A4"/>
+    <w:rPr>
+      <w:rFonts w:asciiTheme="majorHAnsi" w:eastAsiaTheme="majorEastAsia" w:hAnsiTheme="majorHAnsi" w:cstheme="majorBidi"/>
+      <w:caps/>
+      <w:color w:val="2FA085" w:themeColor="accent2" w:themeShade="BF"/>
+      <w:spacing w:val="10"/>
+      <w:sz w:val="28"/>
+      <w:szCs w:val="28"/>
     </w:rPr>
   </w:style>
   <w:style w:type="character" w:styleId="Referenciaintensa">
@@ -931,22 +2705,155 @@
     <w:basedOn w:val="Fuentedeprrafopredeter"/>
     <w:uiPriority w:val="32"/>
     <w:qFormat/>
-    <w:rsid w:val="006B2101"/>
-    <w:rPr>
+    <w:rsid w:val="00EF46A4"/>
+    <w:rPr>
+      <w:rFonts w:asciiTheme="minorHAnsi" w:eastAsiaTheme="minorEastAsia" w:hAnsiTheme="minorHAnsi" w:cstheme="minorBidi"/>
       <w:b/>
       <w:bCs/>
+      <w:caps w:val="0"/>
       <w:smallCaps/>
-      <w:color w:val="0F4761" w:themeColor="accent1" w:themeShade="BF"/>
-      <w:spacing w:val="5"/>
-    </w:rPr>
+      <w:color w:val="191919" w:themeColor="text1" w:themeTint="E6"/>
+      <w:spacing w:val="10"/>
+      <w:w w:val="100"/>
+      <w:position w:val="0"/>
+      <w:sz w:val="20"/>
+      <w:szCs w:val="20"/>
+      <w:u w:val="single"/>
+    </w:rPr>
+  </w:style>
+  <w:style w:type="paragraph" w:styleId="Descripcin">
+    <w:name w:val="caption"/>
+    <w:basedOn w:val="Normal"/>
+    <w:next w:val="Normal"/>
+    <w:uiPriority w:val="35"/>
+    <w:semiHidden/>
+    <w:unhideWhenUsed/>
+    <w:qFormat/>
+    <w:rsid w:val="00EF46A4"/>
+    <w:pPr>
+      <w:spacing w:line="240" w:lineRule="auto"/>
+    </w:pPr>
+    <w:rPr>
+      <w:b/>
+      <w:bCs/>
+      <w:color w:val="4BCAAD" w:themeColor="accent2"/>
+      <w:spacing w:val="10"/>
+      <w:sz w:val="16"/>
+      <w:szCs w:val="16"/>
+    </w:rPr>
+  </w:style>
+  <w:style w:type="character" w:styleId="Fuerte">
+    <w:name w:val="Strong"/>
+    <w:basedOn w:val="Fuentedeprrafopredeter"/>
+    <w:uiPriority w:val="22"/>
+    <w:qFormat/>
+    <w:rsid w:val="00EF46A4"/>
+    <w:rPr>
+      <w:rFonts w:asciiTheme="minorHAnsi" w:eastAsiaTheme="minorEastAsia" w:hAnsiTheme="minorHAnsi" w:cstheme="minorBidi"/>
+      <w:b/>
+      <w:bCs/>
+      <w:spacing w:val="0"/>
+      <w:w w:val="100"/>
+      <w:position w:val="0"/>
+      <w:sz w:val="20"/>
+      <w:szCs w:val="20"/>
+    </w:rPr>
+  </w:style>
+  <w:style w:type="character" w:styleId="nfasis">
+    <w:name w:val="Emphasis"/>
+    <w:basedOn w:val="Fuentedeprrafopredeter"/>
+    <w:uiPriority w:val="20"/>
+    <w:qFormat/>
+    <w:rsid w:val="00EF46A4"/>
+    <w:rPr>
+      <w:rFonts w:asciiTheme="minorHAnsi" w:eastAsiaTheme="minorEastAsia" w:hAnsiTheme="minorHAnsi" w:cstheme="minorBidi"/>
+      <w:i/>
+      <w:iCs/>
+      <w:color w:val="2FA085" w:themeColor="accent2" w:themeShade="BF"/>
+      <w:sz w:val="20"/>
+      <w:szCs w:val="20"/>
+    </w:rPr>
+  </w:style>
+  <w:style w:type="paragraph" w:styleId="Sinespaciado">
+    <w:name w:val="No Spacing"/>
+    <w:uiPriority w:val="1"/>
+    <w:qFormat/>
+    <w:rsid w:val="00EF46A4"/>
+    <w:pPr>
+      <w:spacing w:after="0" w:line="240" w:lineRule="auto"/>
+    </w:pPr>
+  </w:style>
+  <w:style w:type="character" w:styleId="nfasissutil">
+    <w:name w:val="Subtle Emphasis"/>
+    <w:basedOn w:val="Fuentedeprrafopredeter"/>
+    <w:uiPriority w:val="19"/>
+    <w:qFormat/>
+    <w:rsid w:val="00EF46A4"/>
+    <w:rPr>
+      <w:i/>
+      <w:iCs/>
+      <w:color w:val="auto"/>
+    </w:rPr>
+  </w:style>
+  <w:style w:type="character" w:styleId="Referenciasutil">
+    <w:name w:val="Subtle Reference"/>
+    <w:basedOn w:val="Fuentedeprrafopredeter"/>
+    <w:uiPriority w:val="31"/>
+    <w:qFormat/>
+    <w:rsid w:val="00EF46A4"/>
+    <w:rPr>
+      <w:rFonts w:asciiTheme="minorHAnsi" w:eastAsiaTheme="minorEastAsia" w:hAnsiTheme="minorHAnsi" w:cstheme="minorBidi"/>
+      <w:caps w:val="0"/>
+      <w:smallCaps/>
+      <w:color w:val="auto"/>
+      <w:spacing w:val="10"/>
+      <w:w w:val="100"/>
+      <w:sz w:val="20"/>
+      <w:szCs w:val="20"/>
+      <w:u w:val="single" w:color="7F7F7F" w:themeColor="text1" w:themeTint="80"/>
+    </w:rPr>
+  </w:style>
+  <w:style w:type="character" w:styleId="Ttulodellibro">
+    <w:name w:val="Book Title"/>
+    <w:basedOn w:val="Fuentedeprrafopredeter"/>
+    <w:uiPriority w:val="33"/>
+    <w:qFormat/>
+    <w:rsid w:val="00EF46A4"/>
+    <w:rPr>
+      <w:rFonts w:asciiTheme="minorHAnsi" w:eastAsiaTheme="minorEastAsia" w:hAnsiTheme="minorHAnsi" w:cstheme="minorBidi"/>
+      <w:b/>
+      <w:bCs/>
+      <w:i/>
+      <w:iCs/>
+      <w:caps w:val="0"/>
+      <w:smallCaps w:val="0"/>
+      <w:color w:val="auto"/>
+      <w:spacing w:val="10"/>
+      <w:w w:val="100"/>
+      <w:sz w:val="20"/>
+      <w:szCs w:val="20"/>
+    </w:rPr>
+  </w:style>
+  <w:style w:type="paragraph" w:styleId="TtuloTDC">
+    <w:name w:val="TOC Heading"/>
+    <w:basedOn w:val="Ttulo1"/>
+    <w:next w:val="Normal"/>
+    <w:uiPriority w:val="39"/>
+    <w:semiHidden/>
+    <w:unhideWhenUsed/>
+    <w:qFormat/>
+    <w:rsid w:val="00EF46A4"/>
+    <w:pPr>
+      <w:outlineLvl w:val="9"/>
+    </w:pPr>
   </w:style>
 </w:styles>
 </file>
 
 <file path=word/theme/theme1.xml><?xml version="1.0" encoding="utf-8"?>
-<a:theme xmlns:a="http://schemas.openxmlformats.org/drawingml/2006/main" name="Tema de Office">
+<a:theme xmlns:a="http://schemas.openxmlformats.org/drawingml/2006/main" name="Gota">
   <a:themeElements>
-    <a:clrScheme name="Office">
+    <a:clrScheme name="Gota">
       <a:dk1>
         <a:sysClr val="windowText" lastClr="000000"/>
       </a:dk1>
@@ -954,44 +2861,44 @@
         <a:sysClr val="window" lastClr="FFFFFF"/>
       </a:lt1>
       <a:dk2>
-        <a:srgbClr val="0E2841"/>
+        <a:srgbClr val="355071"/>
       </a:dk2>
       <a:lt2>
-        <a:srgbClr val="E8E8E8"/>
+        <a:srgbClr val="AABED7"/>
       </a:lt2>
       <a:accent1>
-        <a:srgbClr val="156082"/>
+        <a:srgbClr val="2FA3EE"/>
       </a:accent1>
       <a:accent2>
-        <a:srgbClr val="E97132"/>
+        <a:srgbClr val="4BCAAD"/>
       </a:accent2>
       <a:accent3>
-        <a:srgbClr val="196B24"/>
+        <a:srgbClr val="86C157"/>
       </a:accent3>
       <a:accent4>
-        <a:srgbClr val="0F9ED5"/>
+        <a:srgbClr val="D99C3F"/>
       </a:accent4>
       <a:accent5>
-        <a:srgbClr val="A02B93"/>
+        <a:srgbClr val="CE6633"/>
       </a:accent5>
       <a:accent6>
-        <a:srgbClr val="4EA72E"/>
+        <a:srgbClr val="A35DD1"/>
       </a:accent6>
       <a:hlink>
-        <a:srgbClr val="467886"/>
+        <a:srgbClr val="56BCFE"/>
       </a:hlink>
       <a:folHlink>
-        <a:srgbClr val="96607D"/>
+        <a:srgbClr val="97C5E3"/>
       </a:folHlink>
     </a:clrScheme>
-    <a:fontScheme name="Office">
+    <a:fontScheme name="Gota">
       <a:majorFont>
-        <a:latin typeface="Aptos Display" panose="02110004020202020204"/>
+        <a:latin typeface="Tw Cen MT" panose="020B0602020104020603"/>
         <a:ea typeface=""/>
         <a:cs typeface=""/>
-        <a:font script="Jpan" typeface="游ゴシック Light"/>
+        <a:font script="Jpan" typeface="ＭＳ Ｐゴシック"/>
         <a:font script="Hang" typeface="맑은 고딕"/>
-        <a:font script="Hans" typeface="等线 Light"/>
+        <a:font script="Hans" typeface="宋体"/>
         <a:font script="Hant" typeface="新細明體"/>
         <a:font script="Arab" typeface="Times New Roman"/>
         <a:font script="Hebr" typeface="Times New Roman"/>
@@ -1019,31 +2926,14 @@
         <a:font script="Viet" typeface="Times New Roman"/>
         <a:font script="Uigh" typeface="Microsoft Uighur"/>
         <a:font script="Geor" typeface="Sylfaen"/>
-        <a:font script="Armn" typeface="Arial"/>
-        <a:font script="Bugi" typeface="Leelawadee UI"/>
-        <a:font script="Bopo" typeface="Microsoft JhengHei"/>
-        <a:font script="Java" typeface="Javanese Text"/>
-        <a:font script="Lisu" typeface="Segoe UI"/>
-        <a:font script="Mymr" typeface="Myanmar Text"/>
-        <a:font script="Nkoo" typeface="Ebrima"/>
-        <a:font script="Olck" typeface="Nirmala UI"/>
-        <a:font script="Osma" typeface="Ebrima"/>
-        <a:font script="Phag" typeface="Phagspa"/>
-        <a:font script="Syrn" typeface="Estrangelo Edessa"/>
-        <a:font script="Syrj" typeface="Estrangelo Edessa"/>
-        <a:font script="Syre" typeface="Estrangelo Edessa"/>
-        <a:font script="Sora" typeface="Nirmala UI"/>
-        <a:font script="Tale" typeface="Microsoft Tai Le"/>
-        <a:font script="Talu" typeface="Microsoft New Tai Lue"/>
-        <a:font script="Tfng" typeface="Ebrima"/>
       </a:majorFont>
       <a:minorFont>
-        <a:latin typeface="Aptos" panose="02110004020202020204"/>
+        <a:latin typeface="Tw Cen MT" panose="020B0602020104020603"/>
         <a:ea typeface=""/>
         <a:cs typeface=""/>
-        <a:font script="Jpan" typeface="游明朝"/>
+        <a:font script="Jpan" typeface="ＭＳ Ｐゴシック"/>
         <a:font script="Hang" typeface="맑은 고딕"/>
-        <a:font script="Hans" typeface="等线"/>
+        <a:font script="Hans" typeface="宋体"/>
         <a:font script="Hant" typeface="新細明體"/>
         <a:font script="Arab" typeface="Arial"/>
         <a:font script="Hebr" typeface="Arial"/>
@@ -1071,27 +2961,105 @@
         <a:font script="Viet" typeface="Arial"/>
         <a:font script="Uigh" typeface="Microsoft Uighur"/>
         <a:font script="Geor" typeface="Sylfaen"/>
-        <a:font script="Armn" typeface="Arial"/>
-        <a:font script="Bugi" typeface="Leelawadee UI"/>
-        <a:font script="Bopo" typeface="Microsoft JhengHei"/>
-        <a:font script="Java" typeface="Javanese Text"/>
-        <a:font script="Lisu" typeface="Segoe UI"/>
-        <a:font script="Mymr" typeface="Myanmar Text"/>
-        <a:font script="Nkoo" typeface="Ebrima"/>
-        <a:font script="Olck" typeface="Nirmala UI"/>
-        <a:font script="Osma" typeface="Ebrima"/>
-        <a:font script="Phag" typeface="Phagspa"/>
-        <a:font script="Syrn" typeface="Estrangelo Edessa"/>
-        <a:font script="Syrj" typeface="Estrangelo Edessa"/>
-        <a:font script="Syre" typeface="Estrangelo Edessa"/>
-        <a:font script="Sora" typeface="Nirmala UI"/>
-        <a:font script="Tale" typeface="Microsoft Tai Le"/>
-        <a:font script="Talu" typeface="Microsoft New Tai Lue"/>
-        <a:font script="Tfng" typeface="Ebrima"/>
       </a:minorFont>
     </a:fontScheme>
-    <a:fmtScheme name="Office">
+    <a:fmtScheme name="Gota">
       <a:fillStyleLst>
+        <a:solidFill>
+          <a:schemeClr val="phClr"/>
+        </a:solidFill>
+        <a:solidFill>
+          <a:schemeClr val="phClr">
+            <a:tint val="69000"/>
+            <a:satMod val="105000"/>
+            <a:lumMod val="110000"/>
+          </a:schemeClr>
+        </a:solidFill>
+        <a:gradFill rotWithShape="1">
+          <a:gsLst>
+            <a:gs pos="0">
+              <a:schemeClr val="phClr">
+                <a:tint val="94000"/>
+                <a:satMod val="100000"/>
+                <a:lumMod val="108000"/>
+              </a:schemeClr>
+            </a:gs>
+            <a:gs pos="50000">
+              <a:schemeClr val="phClr">
+                <a:tint val="98000"/>
+                <a:shade val="100000"/>
+                <a:satMod val="100000"/>
+                <a:lumMod val="100000"/>
+              </a:schemeClr>
+            </a:gs>
+            <a:gs pos="100000">
+              <a:schemeClr val="phClr">
+                <a:shade val="72000"/>
+                <a:satMod val="120000"/>
+                <a:lumMod val="100000"/>
+              </a:schemeClr>
+            </a:gs>
+          </a:gsLst>
+          <a:lin ang="5400000" scaled="0"/>
+        </a:gradFill>
+      </a:fillStyleLst>
+      <a:lnStyleLst>
+        <a:ln w="9525" cap="flat" cmpd="sng" algn="ctr">
+          <a:solidFill>
+            <a:schemeClr val="phClr">
+              <a:shade val="60000"/>
+            </a:schemeClr>
+          </a:solidFill>
+          <a:prstDash val="solid"/>
+        </a:ln>
+        <a:ln w="15875" cap="flat" cmpd="sng" algn="ctr">
+          <a:solidFill>
+            <a:schemeClr val="phClr"/>
+          </a:solidFill>
+          <a:prstDash val="solid"/>
+        </a:ln>
+        <a:ln w="22225" cap="flat" cmpd="sng" algn="ctr">
+          <a:solidFill>
+            <a:schemeClr val="phClr"/>
+          </a:solidFill>
+          <a:prstDash val="solid"/>
+        </a:ln>
+      </a:lnStyleLst>
+      <a:effectStyleLst>
+        <a:effectStyle>
+          <a:effectLst/>
+        </a:effectStyle>
+        <a:effectStyle>
+          <a:effectLst>
+            <a:outerShdw blurRad="50800" dist="25400" dir="5400000" rotWithShape="0">
+              <a:srgbClr val="000000">
+                <a:alpha val="28000"/>
+              </a:srgbClr>
+            </a:outerShdw>
+          </a:effectLst>
+        </a:effectStyle>
+        <a:effectStyle>
+          <a:effectLst>
+            <a:outerShdw blurRad="63500" dist="25400" dir="5400000" algn="ctr" rotWithShape="0">
+              <a:srgbClr val="000000">
+                <a:alpha val="69000"/>
+              </a:srgbClr>
+            </a:outerShdw>
+          </a:effectLst>
+          <a:scene3d>
+            <a:camera prst="orthographicFront">
+              <a:rot lat="0" lon="0" rev="0"/>
+            </a:camera>
+            <a:lightRig rig="balanced" dir="t">
+              <a:rot lat="0" lon="0" rev="1200000"/>
+            </a:lightRig>
+          </a:scene3d>
+          <a:sp3d prstMaterial="plastic">
+            <a:bevelT w="25400" h="25400"/>
+          </a:sp3d>
+        </a:effectStyle>
+      </a:effectStyleLst>
+      <a:bgFillStyleLst>
         <a:solidFill>
           <a:schemeClr val="phClr"/>
         </a:solidFill>
@@ -1099,23 +3067,14 @@
           <a:gsLst>
             <a:gs pos="0">
               <a:schemeClr val="phClr">
+                <a:tint val="90000"/>
                 <a:lumMod val="110000"/>
-                <a:satMod val="105000"/>
-                <a:tint val="67000"/>
-              </a:schemeClr>
-            </a:gs>
-            <a:gs pos="50000">
-              <a:schemeClr val="phClr">
-                <a:lumMod val="105000"/>
-                <a:satMod val="103000"/>
-                <a:tint val="73000"/>
               </a:schemeClr>
             </a:gs>
             <a:gs pos="100000">
               <a:schemeClr val="phClr">
-                <a:lumMod val="105000"/>
-                <a:satMod val="109000"/>
-                <a:tint val="81000"/>
+                <a:shade val="64000"/>
+                <a:lumMod val="88000"/>
               </a:schemeClr>
             </a:gs>
           </a:gsLst>
@@ -1125,101 +3084,18 @@
           <a:gsLst>
             <a:gs pos="0">
               <a:schemeClr val="phClr">
-                <a:satMod val="103000"/>
-                <a:lumMod val="102000"/>
-                <a:tint val="94000"/>
-              </a:schemeClr>
-            </a:gs>
-            <a:gs pos="50000">
-              <a:schemeClr val="phClr">
-                <a:satMod val="110000"/>
-                <a:lumMod val="100000"/>
+                <a:tint val="84000"/>
                 <a:shade val="100000"/>
+                <a:hueMod val="130000"/>
+                <a:satMod val="150000"/>
+                <a:lumMod val="112000"/>
               </a:schemeClr>
             </a:gs>
             <a:gs pos="100000">
               <a:schemeClr val="phClr">
-                <a:lumMod val="99000"/>
-                <a:satMod val="120000"/>
-                <a:shade val="78000"/>
-              </a:schemeClr>
-            </a:gs>
-          </a:gsLst>
-          <a:lin ang="5400000" scaled="0"/>
-        </a:gradFill>
-      </a:fillStyleLst>
-      <a:lnStyleLst>
-        <a:ln w="6350" cap="flat" cmpd="sng" algn="ctr">
-          <a:solidFill>
-            <a:schemeClr val="phClr"/>
-          </a:solidFill>
-          <a:prstDash val="solid"/>
-          <a:miter lim="800000"/>
-        </a:ln>
-        <a:ln w="12700" cap="flat" cmpd="sng" algn="ctr">
-          <a:solidFill>
-            <a:schemeClr val="phClr"/>
-          </a:solidFill>
-          <a:prstDash val="solid"/>
-          <a:miter lim="800000"/>
-        </a:ln>
-        <a:ln w="19050" cap="flat" cmpd="sng" algn="ctr">
-          <a:solidFill>
-            <a:schemeClr val="phClr"/>
-          </a:solidFill>
-          <a:prstDash val="solid"/>
-          <a:miter lim="800000"/>
-        </a:ln>
-      </a:lnStyleLst>
-      <a:effectStyleLst>
-        <a:effectStyle>
-          <a:effectLst/>
-        </a:effectStyle>
-        <a:effectStyle>
-          <a:effectLst/>
-        </a:effectStyle>
-        <a:effectStyle>
-          <a:effectLst>
-            <a:outerShdw blurRad="57150" dist="19050" dir="5400000" algn="ctr" rotWithShape="0">
-              <a:srgbClr val="000000">
-                <a:alpha val="63000"/>
-              </a:srgbClr>
-            </a:outerShdw>
-          </a:effectLst>
-        </a:effectStyle>
-      </a:effectStyleLst>
-      <a:bgFillStyleLst>
-        <a:solidFill>
-          <a:schemeClr val="phClr"/>
-        </a:solidFill>
-        <a:solidFill>
-          <a:schemeClr val="phClr">
-            <a:tint val="95000"/>
-            <a:satMod val="170000"/>
-          </a:schemeClr>
-        </a:solidFill>
-        <a:gradFill rotWithShape="1">
-          <a:gsLst>
-            <a:gs pos="0">
-              <a:schemeClr val="phClr">
-                <a:tint val="93000"/>
-                <a:satMod val="150000"/>
-                <a:shade val="98000"/>
-                <a:lumMod val="102000"/>
-              </a:schemeClr>
-            </a:gs>
-            <a:gs pos="50000">
-              <a:schemeClr val="phClr">
-                <a:tint val="98000"/>
-                <a:satMod val="130000"/>
-                <a:shade val="90000"/>
-                <a:lumMod val="103000"/>
-              </a:schemeClr>
-            </a:gs>
-            <a:gs pos="100000">
-              <a:schemeClr val="phClr">
-                <a:shade val="63000"/>
-                <a:satMod val="120000"/>
+                <a:shade val="92000"/>
+                <a:satMod val="140000"/>
+                <a:lumMod val="110000"/>
               </a:schemeClr>
             </a:gs>
           </a:gsLst>
@@ -1232,7 +3108,7 @@
   <a:extraClrSchemeLst/>
   <a:extLst>
     <a:ext uri="{05A4C25C-085E-4340-85A3-A5531E510DB2}">
-      <thm15:themeFamily xmlns:thm15="http://schemas.microsoft.com/office/thememl/2012/main" name="Office Theme" id="{2E142A2C-CD16-42D6-873A-C26D2A0506FA}" vid="{1BDDFF52-6CD6-40A5-AB3C-68EB2F1E4D0A}"/>
+      <thm15:themeFamily xmlns:thm15="http://schemas.microsoft.com/office/thememl/2012/main" name="Droplet" id="{8984A317-299A-4E50-B45D-BFC9EDE2337A}" vid="{A633B6A3-9E7F-4C10-9C98-2517A3134361}"/>
     </a:ext>
   </a:extLst>
 </a:theme>

</xml_diff>